<commit_message>
Updates to various problems
</commit_message>
<xml_diff>
--- a/CS3185/HW4/HW4_doc.docx
+++ b/CS3185/HW4/HW4_doc.docx
@@ -9,6 +9,8 @@
           <w:rFonts w:ascii="Times New Roman" w:hAnsi="Times New Roman" w:cs="Times New Roman"/>
         </w:rPr>
       </w:pPr>
+      <w:bookmarkStart w:id="0" w:name="_Hlk211565039"/>
+      <w:bookmarkEnd w:id="0"/>
       <w:r>
         <w:rPr>
           <w:rFonts w:ascii="Times New Roman" w:hAnsi="Times New Roman" w:cs="Times New Roman"/>
@@ -1423,7 +1425,7 @@
         <w:rPr>
           <w:rFonts w:ascii="Times New Roman" w:hAnsi="Times New Roman" w:cs="Times New Roman"/>
         </w:rPr>
-        <w:t>aST</w:t>
+        <w:t>aSB</w:t>
       </w:r>
       <w:proofErr w:type="spellEnd"/>
       <w:r>
@@ -1444,6 +1446,224 @@
         <w:rPr>
           <w:rFonts w:ascii="Times New Roman" w:hAnsi="Times New Roman" w:cs="Times New Roman"/>
         </w:rPr>
+        <w:t xml:space="preserve">B -&gt; bb | </w:t>
+      </w:r>
+      <w:proofErr w:type="spellStart"/>
+      <w:r>
+        <w:rPr>
+          <w:rFonts w:ascii="Times New Roman" w:hAnsi="Times New Roman" w:cs="Times New Roman"/>
+        </w:rPr>
+        <w:t>bbb</w:t>
+      </w:r>
+      <w:proofErr w:type="spellEnd"/>
+    </w:p>
+    <w:p>
+      <w:pPr>
+        <w:contextualSpacing/>
+        <w:rPr>
+          <w:rFonts w:ascii="Times New Roman" w:hAnsi="Times New Roman" w:cs="Times New Roman"/>
+        </w:rPr>
+      </w:pPr>
+    </w:p>
+    <w:p>
+      <w:pPr>
+        <w:contextualSpacing/>
+        <w:rPr>
+          <w:rFonts w:ascii="Times New Roman" w:hAnsi="Times New Roman" w:cs="Times New Roman"/>
+        </w:rPr>
+      </w:pPr>
+    </w:p>
+    <w:p>
+      <w:pPr>
+        <w:contextualSpacing/>
+        <w:rPr>
+          <w:rFonts w:ascii="Times New Roman" w:hAnsi="Times New Roman" w:cs="Times New Roman"/>
+          <w:b/>
+          <w:bCs/>
+        </w:rPr>
+      </w:pPr>
+      <w:r>
+        <w:rPr>
+          <w:rFonts w:ascii="Times New Roman" w:hAnsi="Times New Roman" w:cs="Times New Roman"/>
+          <w:b/>
+          <w:bCs/>
+        </w:rPr>
+        <w:t xml:space="preserve">g) L = </w:t>
+      </w:r>
+      <w:proofErr w:type="gramStart"/>
+      <w:r>
+        <w:rPr>
+          <w:rFonts w:ascii="Times New Roman" w:hAnsi="Times New Roman" w:cs="Times New Roman"/>
+          <w:b/>
+          <w:bCs/>
+        </w:rPr>
+        <w:t>{ w</w:t>
+      </w:r>
+      <w:proofErr w:type="gramEnd"/>
+      <w:r>
+        <w:rPr>
+          <w:rFonts w:ascii="Times New Roman" w:hAnsi="Times New Roman" w:cs="Times New Roman"/>
+          <w:b/>
+          <w:bCs/>
+        </w:rPr>
+        <w:t xml:space="preserve"> ϵ </w:t>
+      </w:r>
+      <w:proofErr w:type="gramStart"/>
+      <w:r>
+        <w:rPr>
+          <w:rFonts w:ascii="Times New Roman" w:hAnsi="Times New Roman" w:cs="Times New Roman"/>
+          <w:b/>
+          <w:bCs/>
+        </w:rPr>
+        <w:t xml:space="preserve">{ </w:t>
+      </w:r>
+      <w:proofErr w:type="spellStart"/>
+      <w:r>
+        <w:rPr>
+          <w:rFonts w:ascii="Times New Roman" w:hAnsi="Times New Roman" w:cs="Times New Roman"/>
+          <w:b/>
+          <w:bCs/>
+        </w:rPr>
+        <w:t>a</w:t>
+      </w:r>
+      <w:proofErr w:type="gramEnd"/>
+      <w:r>
+        <w:rPr>
+          <w:rFonts w:ascii="Times New Roman" w:hAnsi="Times New Roman" w:cs="Times New Roman"/>
+          <w:b/>
+          <w:bCs/>
+        </w:rPr>
+        <w:t>,</w:t>
+      </w:r>
+      <w:proofErr w:type="gramStart"/>
+      <w:r>
+        <w:rPr>
+          <w:rFonts w:ascii="Times New Roman" w:hAnsi="Times New Roman" w:cs="Times New Roman"/>
+          <w:b/>
+          <w:bCs/>
+        </w:rPr>
+        <w:t>b</w:t>
+      </w:r>
+      <w:proofErr w:type="spellEnd"/>
+      <w:r>
+        <w:rPr>
+          <w:rFonts w:ascii="Times New Roman" w:hAnsi="Times New Roman" w:cs="Times New Roman"/>
+          <w:b/>
+          <w:bCs/>
+        </w:rPr>
+        <w:t xml:space="preserve"> }</w:t>
+      </w:r>
+      <w:proofErr w:type="gramEnd"/>
+      <w:r>
+        <w:rPr>
+          <w:rFonts w:ascii="Times New Roman" w:hAnsi="Times New Roman" w:cs="Times New Roman"/>
+          <w:b/>
+          <w:bCs/>
+        </w:rPr>
+        <w:t xml:space="preserve">* : </w:t>
+      </w:r>
+      <w:proofErr w:type="spellStart"/>
+      <w:r>
+        <w:rPr>
+          <w:rFonts w:ascii="Times New Roman" w:hAnsi="Times New Roman" w:cs="Times New Roman"/>
+          <w:b/>
+          <w:bCs/>
+        </w:rPr>
+        <w:t>n</w:t>
+      </w:r>
+      <w:r>
+        <w:rPr>
+          <w:rFonts w:ascii="Times New Roman" w:hAnsi="Times New Roman" w:cs="Times New Roman"/>
+          <w:b/>
+          <w:bCs/>
+          <w:vertAlign w:val="subscript"/>
+        </w:rPr>
+        <w:t>a</w:t>
+      </w:r>
+      <w:proofErr w:type="spellEnd"/>
+      <w:r>
+        <w:rPr>
+          <w:rFonts w:ascii="Times New Roman" w:hAnsi="Times New Roman" w:cs="Times New Roman"/>
+          <w:b/>
+          <w:bCs/>
+        </w:rPr>
+        <w:t>(w) = 2n</w:t>
+      </w:r>
+      <w:r>
+        <w:rPr>
+          <w:rFonts w:ascii="Times New Roman" w:hAnsi="Times New Roman" w:cs="Times New Roman"/>
+          <w:b/>
+          <w:bCs/>
+          <w:vertAlign w:val="subscript"/>
+        </w:rPr>
+        <w:t>b</w:t>
+      </w:r>
+      <w:r>
+        <w:rPr>
+          <w:rFonts w:ascii="Times New Roman" w:hAnsi="Times New Roman" w:cs="Times New Roman"/>
+          <w:b/>
+          <w:bCs/>
+        </w:rPr>
+        <w:t xml:space="preserve">(w) + </w:t>
+      </w:r>
+      <w:proofErr w:type="gramStart"/>
+      <w:r>
+        <w:rPr>
+          <w:rFonts w:ascii="Times New Roman" w:hAnsi="Times New Roman" w:cs="Times New Roman"/>
+          <w:b/>
+          <w:bCs/>
+        </w:rPr>
+        <w:t>1 }</w:t>
+      </w:r>
+      <w:proofErr w:type="gramEnd"/>
+    </w:p>
+    <w:p>
+      <w:pPr>
+        <w:contextualSpacing/>
+        <w:rPr>
+          <w:rFonts w:ascii="Times New Roman" w:hAnsi="Times New Roman" w:cs="Times New Roman"/>
+        </w:rPr>
+      </w:pPr>
+    </w:p>
+    <w:p>
+      <w:pPr>
+        <w:contextualSpacing/>
+        <w:rPr>
+          <w:rFonts w:ascii="Times New Roman" w:hAnsi="Times New Roman" w:cs="Times New Roman"/>
+        </w:rPr>
+      </w:pPr>
+      <w:r>
+        <w:rPr>
+          <w:rFonts w:ascii="Times New Roman" w:hAnsi="Times New Roman" w:cs="Times New Roman"/>
+        </w:rPr>
+        <w:t xml:space="preserve">S -&gt; </w:t>
+      </w:r>
+      <w:proofErr w:type="spellStart"/>
+      <w:r>
+        <w:rPr>
+          <w:rFonts w:ascii="Times New Roman" w:hAnsi="Times New Roman" w:cs="Times New Roman"/>
+        </w:rPr>
+        <w:t>T</w:t>
+      </w:r>
+      <w:r>
+        <w:rPr>
+          <w:rFonts w:ascii="Times New Roman" w:hAnsi="Times New Roman" w:cs="Times New Roman"/>
+        </w:rPr>
+        <w:t>aT</w:t>
+      </w:r>
+      <w:proofErr w:type="spellEnd"/>
+    </w:p>
+    <w:p>
+      <w:pPr>
+        <w:contextualSpacing/>
+        <w:rPr>
+          <w:rFonts w:ascii="Times New Roman" w:hAnsi="Times New Roman" w:cs="Times New Roman"/>
+        </w:rPr>
+      </w:pPr>
+      <w:r>
+        <w:rPr>
+          <w:rFonts w:ascii="Times New Roman" w:hAnsi="Times New Roman" w:cs="Times New Roman"/>
+        </w:rPr>
         <w:t xml:space="preserve">T -&gt; </w:t>
       </w:r>
       <w:proofErr w:type="spellStart"/>
@@ -1451,7 +1671,7 @@
         <w:rPr>
           <w:rFonts w:ascii="Times New Roman" w:hAnsi="Times New Roman" w:cs="Times New Roman"/>
         </w:rPr>
-        <w:t>bbT</w:t>
+        <w:t>aabT</w:t>
       </w:r>
       <w:proofErr w:type="spellEnd"/>
       <w:r>
@@ -1465,42 +1685,230 @@
         <w:rPr>
           <w:rFonts w:ascii="Times New Roman" w:hAnsi="Times New Roman" w:cs="Times New Roman"/>
         </w:rPr>
-        <w:t>bbbT</w:t>
-      </w:r>
-      <w:proofErr w:type="spellEnd"/>
-    </w:p>
-    <w:p>
-      <w:pPr>
-        <w:contextualSpacing/>
-        <w:rPr>
-          <w:rFonts w:ascii="Times New Roman" w:hAnsi="Times New Roman" w:cs="Times New Roman"/>
-        </w:rPr>
-      </w:pPr>
-    </w:p>
-    <w:p>
-      <w:pPr>
-        <w:contextualSpacing/>
-        <w:rPr>
-          <w:rFonts w:ascii="Times New Roman" w:hAnsi="Times New Roman" w:cs="Times New Roman"/>
-        </w:rPr>
-      </w:pPr>
-    </w:p>
-    <w:p>
-      <w:pPr>
-        <w:contextualSpacing/>
-        <w:rPr>
-          <w:rFonts w:ascii="Times New Roman" w:hAnsi="Times New Roman" w:cs="Times New Roman"/>
-          <w:b/>
-          <w:bCs/>
-        </w:rPr>
-      </w:pPr>
-      <w:r>
-        <w:rPr>
-          <w:rFonts w:ascii="Times New Roman" w:hAnsi="Times New Roman" w:cs="Times New Roman"/>
-          <w:b/>
-          <w:bCs/>
-        </w:rPr>
-        <w:t xml:space="preserve">g) L = </w:t>
+        <w:t>aaTb</w:t>
+      </w:r>
+      <w:proofErr w:type="spellEnd"/>
+      <w:r>
+        <w:rPr>
+          <w:rFonts w:ascii="Times New Roman" w:hAnsi="Times New Roman" w:cs="Times New Roman"/>
+        </w:rPr>
+        <w:t xml:space="preserve"> | </w:t>
+      </w:r>
+      <w:proofErr w:type="spellStart"/>
+      <w:r>
+        <w:rPr>
+          <w:rFonts w:ascii="Times New Roman" w:hAnsi="Times New Roman" w:cs="Times New Roman"/>
+        </w:rPr>
+        <w:t>aTab</w:t>
+      </w:r>
+      <w:proofErr w:type="spellEnd"/>
+      <w:r>
+        <w:rPr>
+          <w:rFonts w:ascii="Times New Roman" w:hAnsi="Times New Roman" w:cs="Times New Roman"/>
+        </w:rPr>
+        <w:t xml:space="preserve"> |</w:t>
+      </w:r>
+      <w:r>
+        <w:rPr>
+          <w:rFonts w:ascii="Times New Roman" w:hAnsi="Times New Roman" w:cs="Times New Roman"/>
+        </w:rPr>
+        <w:t xml:space="preserve"> Taab |</w:t>
+      </w:r>
+      <w:r>
+        <w:rPr>
+          <w:rFonts w:ascii="Times New Roman" w:hAnsi="Times New Roman" w:cs="Times New Roman"/>
+        </w:rPr>
+        <w:t xml:space="preserve"> </w:t>
+      </w:r>
+      <w:proofErr w:type="spellStart"/>
+      <w:r>
+        <w:rPr>
+          <w:rFonts w:ascii="Times New Roman" w:hAnsi="Times New Roman" w:cs="Times New Roman"/>
+        </w:rPr>
+        <w:t>aba</w:t>
+      </w:r>
+      <w:r>
+        <w:rPr>
+          <w:rFonts w:ascii="Times New Roman" w:hAnsi="Times New Roman" w:cs="Times New Roman"/>
+        </w:rPr>
+        <w:t>T</w:t>
+      </w:r>
+      <w:proofErr w:type="spellEnd"/>
+      <w:r>
+        <w:rPr>
+          <w:rFonts w:ascii="Times New Roman" w:hAnsi="Times New Roman" w:cs="Times New Roman"/>
+        </w:rPr>
+        <w:t xml:space="preserve"> | </w:t>
+      </w:r>
+      <w:proofErr w:type="spellStart"/>
+      <w:r>
+        <w:rPr>
+          <w:rFonts w:ascii="Times New Roman" w:hAnsi="Times New Roman" w:cs="Times New Roman"/>
+        </w:rPr>
+        <w:t>ab</w:t>
+      </w:r>
+      <w:r>
+        <w:rPr>
+          <w:rFonts w:ascii="Times New Roman" w:hAnsi="Times New Roman" w:cs="Times New Roman"/>
+        </w:rPr>
+        <w:t>T</w:t>
+      </w:r>
+      <w:r>
+        <w:rPr>
+          <w:rFonts w:ascii="Times New Roman" w:hAnsi="Times New Roman" w:cs="Times New Roman"/>
+        </w:rPr>
+        <w:t>a</w:t>
+      </w:r>
+      <w:proofErr w:type="spellEnd"/>
+      <w:r>
+        <w:rPr>
+          <w:rFonts w:ascii="Times New Roman" w:hAnsi="Times New Roman" w:cs="Times New Roman"/>
+        </w:rPr>
+        <w:t xml:space="preserve"> | </w:t>
+      </w:r>
+      <w:proofErr w:type="spellStart"/>
+      <w:r>
+        <w:rPr>
+          <w:rFonts w:ascii="Times New Roman" w:hAnsi="Times New Roman" w:cs="Times New Roman"/>
+        </w:rPr>
+        <w:t>a</w:t>
+      </w:r>
+      <w:r>
+        <w:rPr>
+          <w:rFonts w:ascii="Times New Roman" w:hAnsi="Times New Roman" w:cs="Times New Roman"/>
+        </w:rPr>
+        <w:t>T</w:t>
+      </w:r>
+      <w:r>
+        <w:rPr>
+          <w:rFonts w:ascii="Times New Roman" w:hAnsi="Times New Roman" w:cs="Times New Roman"/>
+        </w:rPr>
+        <w:t>ba</w:t>
+      </w:r>
+      <w:proofErr w:type="spellEnd"/>
+      <w:r>
+        <w:rPr>
+          <w:rFonts w:ascii="Times New Roman" w:hAnsi="Times New Roman" w:cs="Times New Roman"/>
+        </w:rPr>
+        <w:t xml:space="preserve"> | T</w:t>
+      </w:r>
+      <w:r>
+        <w:rPr>
+          <w:rFonts w:ascii="Times New Roman" w:hAnsi="Times New Roman" w:cs="Times New Roman"/>
+        </w:rPr>
+        <w:t>aba</w:t>
+      </w:r>
+      <w:r>
+        <w:rPr>
+          <w:rFonts w:ascii="Times New Roman" w:hAnsi="Times New Roman" w:cs="Times New Roman"/>
+        </w:rPr>
+        <w:t xml:space="preserve"> | </w:t>
+      </w:r>
+      <w:proofErr w:type="spellStart"/>
+      <w:r>
+        <w:rPr>
+          <w:rFonts w:ascii="Times New Roman" w:hAnsi="Times New Roman" w:cs="Times New Roman"/>
+        </w:rPr>
+        <w:t>baaT</w:t>
+      </w:r>
+      <w:proofErr w:type="spellEnd"/>
+      <w:r>
+        <w:rPr>
+          <w:rFonts w:ascii="Times New Roman" w:hAnsi="Times New Roman" w:cs="Times New Roman"/>
+        </w:rPr>
+        <w:t xml:space="preserve"> | </w:t>
+      </w:r>
+      <w:proofErr w:type="spellStart"/>
+      <w:r>
+        <w:rPr>
+          <w:rFonts w:ascii="Times New Roman" w:hAnsi="Times New Roman" w:cs="Times New Roman"/>
+        </w:rPr>
+        <w:t>baTa</w:t>
+      </w:r>
+      <w:proofErr w:type="spellEnd"/>
+      <w:r>
+        <w:rPr>
+          <w:rFonts w:ascii="Times New Roman" w:hAnsi="Times New Roman" w:cs="Times New Roman"/>
+        </w:rPr>
+        <w:t xml:space="preserve"> | </w:t>
+      </w:r>
+      <w:proofErr w:type="spellStart"/>
+      <w:r>
+        <w:rPr>
+          <w:rFonts w:ascii="Times New Roman" w:hAnsi="Times New Roman" w:cs="Times New Roman"/>
+        </w:rPr>
+        <w:t>bTaa</w:t>
+      </w:r>
+      <w:proofErr w:type="spellEnd"/>
+      <w:r>
+        <w:rPr>
+          <w:rFonts w:ascii="Times New Roman" w:hAnsi="Times New Roman" w:cs="Times New Roman"/>
+        </w:rPr>
+        <w:t xml:space="preserve"> | </w:t>
+      </w:r>
+      <w:proofErr w:type="spellStart"/>
+      <w:r>
+        <w:rPr>
+          <w:rFonts w:ascii="Times New Roman" w:hAnsi="Times New Roman" w:cs="Times New Roman"/>
+        </w:rPr>
+        <w:t>Tbaa</w:t>
+      </w:r>
+      <w:proofErr w:type="spellEnd"/>
+      <w:r>
+        <w:rPr>
+          <w:rFonts w:ascii="Times New Roman" w:hAnsi="Times New Roman" w:cs="Times New Roman"/>
+        </w:rPr>
+        <w:t xml:space="preserve"> | λ</w:t>
+      </w:r>
+    </w:p>
+    <w:p>
+      <w:pPr>
+        <w:contextualSpacing/>
+        <w:rPr>
+          <w:rFonts w:ascii="Times New Roman" w:hAnsi="Times New Roman" w:cs="Times New Roman"/>
+        </w:rPr>
+      </w:pPr>
+    </w:p>
+    <w:p>
+      <w:pPr>
+        <w:contextualSpacing/>
+        <w:rPr>
+          <w:rFonts w:ascii="Times New Roman" w:hAnsi="Times New Roman" w:cs="Times New Roman"/>
+        </w:rPr>
+      </w:pPr>
+    </w:p>
+    <w:p>
+      <w:pPr>
+        <w:contextualSpacing/>
+        <w:rPr>
+          <w:rFonts w:ascii="Times New Roman" w:hAnsi="Times New Roman" w:cs="Times New Roman"/>
+          <w:b/>
+          <w:bCs/>
+        </w:rPr>
+      </w:pPr>
+      <w:r>
+        <w:rPr>
+          <w:rFonts w:ascii="Times New Roman" w:hAnsi="Times New Roman" w:cs="Times New Roman"/>
+          <w:b/>
+          <w:bCs/>
+        </w:rPr>
+        <w:t>12) Find CFGs for the following languages</w:t>
+      </w:r>
+    </w:p>
+    <w:p>
+      <w:pPr>
+        <w:contextualSpacing/>
+        <w:rPr>
+          <w:rFonts w:ascii="Times New Roman" w:hAnsi="Times New Roman" w:cs="Times New Roman"/>
+        </w:rPr>
+      </w:pPr>
+      <w:r>
+        <w:rPr>
+          <w:rFonts w:ascii="Times New Roman" w:hAnsi="Times New Roman" w:cs="Times New Roman"/>
+          <w:b/>
+          <w:bCs/>
+        </w:rPr>
+        <w:t xml:space="preserve">c) L = </w:t>
       </w:r>
       <w:proofErr w:type="gramStart"/>
       <w:r>
@@ -1509,8 +1917,61 @@
           <w:b/>
           <w:bCs/>
         </w:rPr>
-        <w:t>{ w</w:t>
-      </w:r>
+        <w:t xml:space="preserve">{ </w:t>
+      </w:r>
+      <w:proofErr w:type="spellStart"/>
+      <w:r>
+        <w:rPr>
+          <w:rFonts w:ascii="Times New Roman" w:hAnsi="Times New Roman" w:cs="Times New Roman"/>
+          <w:b/>
+          <w:bCs/>
+        </w:rPr>
+        <w:t>a</w:t>
+      </w:r>
+      <w:r>
+        <w:rPr>
+          <w:rFonts w:ascii="Times New Roman" w:hAnsi="Times New Roman" w:cs="Times New Roman"/>
+          <w:b/>
+          <w:bCs/>
+          <w:vertAlign w:val="superscript"/>
+        </w:rPr>
+        <w:t>n</w:t>
+      </w:r>
+      <w:r>
+        <w:rPr>
+          <w:rFonts w:ascii="Times New Roman" w:hAnsi="Times New Roman" w:cs="Times New Roman"/>
+          <w:b/>
+          <w:bCs/>
+        </w:rPr>
+        <w:t>b</w:t>
+      </w:r>
+      <w:r>
+        <w:rPr>
+          <w:rFonts w:ascii="Times New Roman" w:hAnsi="Times New Roman" w:cs="Times New Roman"/>
+          <w:b/>
+          <w:bCs/>
+          <w:vertAlign w:val="superscript"/>
+        </w:rPr>
+        <w:t>m</w:t>
+      </w:r>
+      <w:r>
+        <w:rPr>
+          <w:rFonts w:ascii="Times New Roman" w:hAnsi="Times New Roman" w:cs="Times New Roman"/>
+          <w:b/>
+          <w:bCs/>
+        </w:rPr>
+        <w:t>c</w:t>
+      </w:r>
+      <w:r>
+        <w:rPr>
+          <w:rFonts w:ascii="Times New Roman" w:hAnsi="Times New Roman" w:cs="Times New Roman"/>
+          <w:b/>
+          <w:bCs/>
+          <w:vertAlign w:val="superscript"/>
+        </w:rPr>
+        <w:t>k</w:t>
+      </w:r>
+      <w:proofErr w:type="spellEnd"/>
       <w:proofErr w:type="gramEnd"/>
       <w:r>
         <w:rPr>
@@ -1518,7 +1979,7 @@
           <w:b/>
           <w:bCs/>
         </w:rPr>
-        <w:t xml:space="preserve"> ϵ </w:t>
+        <w:t xml:space="preserve">, k = n + </w:t>
       </w:r>
       <w:proofErr w:type="gramStart"/>
       <w:r>
@@ -1527,6 +1988,126 @@
           <w:b/>
           <w:bCs/>
         </w:rPr>
+        <w:t>m }</w:t>
+      </w:r>
+      <w:proofErr w:type="gramEnd"/>
+    </w:p>
+    <w:p>
+      <w:pPr>
+        <w:contextualSpacing/>
+        <w:rPr>
+          <w:rFonts w:ascii="Times New Roman" w:hAnsi="Times New Roman" w:cs="Times New Roman"/>
+        </w:rPr>
+      </w:pPr>
+    </w:p>
+    <w:p>
+      <w:pPr>
+        <w:contextualSpacing/>
+        <w:rPr>
+          <w:rFonts w:ascii="Times New Roman" w:hAnsi="Times New Roman" w:cs="Times New Roman"/>
+        </w:rPr>
+      </w:pPr>
+      <w:r>
+        <w:rPr>
+          <w:rFonts w:ascii="Times New Roman" w:hAnsi="Times New Roman" w:cs="Times New Roman"/>
+        </w:rPr>
+        <w:t xml:space="preserve">S -&gt; </w:t>
+      </w:r>
+      <w:proofErr w:type="spellStart"/>
+      <w:r>
+        <w:rPr>
+          <w:rFonts w:ascii="Times New Roman" w:hAnsi="Times New Roman" w:cs="Times New Roman"/>
+        </w:rPr>
+        <w:t>aSc</w:t>
+      </w:r>
+      <w:proofErr w:type="spellEnd"/>
+      <w:r>
+        <w:rPr>
+          <w:rFonts w:ascii="Times New Roman" w:hAnsi="Times New Roman" w:cs="Times New Roman"/>
+        </w:rPr>
+        <w:t xml:space="preserve"> | T</w:t>
+      </w:r>
+    </w:p>
+    <w:p>
+      <w:pPr>
+        <w:contextualSpacing/>
+        <w:rPr>
+          <w:rFonts w:ascii="Times New Roman" w:hAnsi="Times New Roman" w:cs="Times New Roman"/>
+        </w:rPr>
+      </w:pPr>
+      <w:r>
+        <w:rPr>
+          <w:rFonts w:ascii="Times New Roman" w:hAnsi="Times New Roman" w:cs="Times New Roman"/>
+        </w:rPr>
+        <w:t xml:space="preserve">T -&gt; </w:t>
+      </w:r>
+      <w:proofErr w:type="spellStart"/>
+      <w:r>
+        <w:rPr>
+          <w:rFonts w:ascii="Times New Roman" w:hAnsi="Times New Roman" w:cs="Times New Roman"/>
+        </w:rPr>
+        <w:t>b</w:t>
+      </w:r>
+      <w:r>
+        <w:rPr>
+          <w:rFonts w:ascii="Times New Roman" w:hAnsi="Times New Roman" w:cs="Times New Roman"/>
+        </w:rPr>
+        <w:t>T</w:t>
+      </w:r>
+      <w:r>
+        <w:rPr>
+          <w:rFonts w:ascii="Times New Roman" w:hAnsi="Times New Roman" w:cs="Times New Roman"/>
+        </w:rPr>
+        <w:t>c</w:t>
+      </w:r>
+      <w:proofErr w:type="spellEnd"/>
+      <w:r>
+        <w:rPr>
+          <w:rFonts w:ascii="Times New Roman" w:hAnsi="Times New Roman" w:cs="Times New Roman"/>
+        </w:rPr>
+        <w:t xml:space="preserve"> | λ</w:t>
+      </w:r>
+    </w:p>
+    <w:p>
+      <w:pPr>
+        <w:contextualSpacing/>
+        <w:rPr>
+          <w:rFonts w:ascii="Times New Roman" w:hAnsi="Times New Roman" w:cs="Times New Roman"/>
+        </w:rPr>
+      </w:pPr>
+    </w:p>
+    <w:p>
+      <w:pPr>
+        <w:contextualSpacing/>
+        <w:rPr>
+          <w:rFonts w:ascii="Times New Roman" w:hAnsi="Times New Roman" w:cs="Times New Roman"/>
+        </w:rPr>
+      </w:pPr>
+    </w:p>
+    <w:p>
+      <w:pPr>
+        <w:contextualSpacing/>
+        <w:rPr>
+          <w:rFonts w:ascii="Times New Roman" w:hAnsi="Times New Roman" w:cs="Times New Roman"/>
+          <w:b/>
+          <w:bCs/>
+        </w:rPr>
+      </w:pPr>
+      <w:r>
+        <w:rPr>
+          <w:rFonts w:ascii="Times New Roman" w:hAnsi="Times New Roman" w:cs="Times New Roman"/>
+          <w:b/>
+          <w:bCs/>
+        </w:rPr>
+        <w:t xml:space="preserve">f) L = </w:t>
+      </w:r>
+      <w:proofErr w:type="gramStart"/>
+      <w:r>
+        <w:rPr>
+          <w:rFonts w:ascii="Times New Roman" w:hAnsi="Times New Roman" w:cs="Times New Roman"/>
+          <w:b/>
+          <w:bCs/>
+        </w:rPr>
         <w:t xml:space="preserve">{ </w:t>
       </w:r>
       <w:proofErr w:type="spellStart"/>
@@ -1538,6 +2119,50 @@
         </w:rPr>
         <w:t>a</w:t>
       </w:r>
+      <w:r>
+        <w:rPr>
+          <w:rFonts w:ascii="Times New Roman" w:hAnsi="Times New Roman" w:cs="Times New Roman"/>
+          <w:b/>
+          <w:bCs/>
+          <w:vertAlign w:val="superscript"/>
+        </w:rPr>
+        <w:t>n</w:t>
+      </w:r>
+      <w:r>
+        <w:rPr>
+          <w:rFonts w:ascii="Times New Roman" w:hAnsi="Times New Roman" w:cs="Times New Roman"/>
+          <w:b/>
+          <w:bCs/>
+        </w:rPr>
+        <w:t>b</w:t>
+      </w:r>
+      <w:r>
+        <w:rPr>
+          <w:rFonts w:ascii="Times New Roman" w:hAnsi="Times New Roman" w:cs="Times New Roman"/>
+          <w:b/>
+          <w:bCs/>
+          <w:vertAlign w:val="superscript"/>
+        </w:rPr>
+        <w:t>m</w:t>
+      </w:r>
+      <w:r>
+        <w:rPr>
+          <w:rFonts w:ascii="Times New Roman" w:hAnsi="Times New Roman" w:cs="Times New Roman"/>
+          <w:b/>
+          <w:bCs/>
+        </w:rPr>
+        <w:t>c</w:t>
+      </w:r>
+      <w:r>
+        <w:rPr>
+          <w:rFonts w:ascii="Times New Roman" w:hAnsi="Times New Roman" w:cs="Times New Roman"/>
+          <w:b/>
+          <w:bCs/>
+          <w:vertAlign w:val="superscript"/>
+        </w:rPr>
+        <w:t>k</w:t>
+      </w:r>
+      <w:proofErr w:type="spellEnd"/>
       <w:proofErr w:type="gramEnd"/>
       <w:r>
         <w:rPr>
@@ -1545,6 +2170,451 @@
           <w:b/>
           <w:bCs/>
         </w:rPr>
+        <w:t xml:space="preserve">, k ≠ n + </w:t>
+      </w:r>
+      <w:proofErr w:type="gramStart"/>
+      <w:r>
+        <w:rPr>
+          <w:rFonts w:ascii="Times New Roman" w:hAnsi="Times New Roman" w:cs="Times New Roman"/>
+          <w:b/>
+          <w:bCs/>
+        </w:rPr>
+        <w:t>m }</w:t>
+      </w:r>
+      <w:proofErr w:type="gramEnd"/>
+    </w:p>
+    <w:p>
+      <w:pPr>
+        <w:contextualSpacing/>
+        <w:rPr>
+          <w:rFonts w:ascii="Times New Roman" w:hAnsi="Times New Roman" w:cs="Times New Roman"/>
+        </w:rPr>
+      </w:pPr>
+    </w:p>
+    <w:p>
+      <w:pPr>
+        <w:contextualSpacing/>
+        <w:rPr>
+          <w:rFonts w:ascii="Times New Roman" w:hAnsi="Times New Roman" w:cs="Times New Roman"/>
+        </w:rPr>
+      </w:pPr>
+      <w:r>
+        <w:rPr>
+          <w:rFonts w:ascii="Times New Roman" w:hAnsi="Times New Roman" w:cs="Times New Roman"/>
+        </w:rPr>
+        <w:t>S -&gt; T | U</w:t>
+      </w:r>
+    </w:p>
+    <w:p>
+      <w:pPr>
+        <w:contextualSpacing/>
+        <w:rPr>
+          <w:rFonts w:ascii="Times New Roman" w:hAnsi="Times New Roman" w:cs="Times New Roman"/>
+        </w:rPr>
+      </w:pPr>
+    </w:p>
+    <w:p>
+      <w:pPr>
+        <w:contextualSpacing/>
+        <w:rPr>
+          <w:rFonts w:ascii="Times New Roman" w:hAnsi="Times New Roman" w:cs="Times New Roman"/>
+        </w:rPr>
+      </w:pPr>
+      <w:r>
+        <w:rPr>
+          <w:rFonts w:ascii="Times New Roman" w:hAnsi="Times New Roman" w:cs="Times New Roman"/>
+        </w:rPr>
+        <w:t>T -&gt; A | C</w:t>
+      </w:r>
+    </w:p>
+    <w:p>
+      <w:pPr>
+        <w:contextualSpacing/>
+        <w:rPr>
+          <w:rFonts w:ascii="Times New Roman" w:hAnsi="Times New Roman" w:cs="Times New Roman"/>
+        </w:rPr>
+      </w:pPr>
+      <w:r>
+        <w:rPr>
+          <w:rFonts w:ascii="Times New Roman" w:hAnsi="Times New Roman" w:cs="Times New Roman"/>
+        </w:rPr>
+        <w:t xml:space="preserve">A -&gt; </w:t>
+      </w:r>
+      <w:proofErr w:type="spellStart"/>
+      <w:r>
+        <w:rPr>
+          <w:rFonts w:ascii="Times New Roman" w:hAnsi="Times New Roman" w:cs="Times New Roman"/>
+        </w:rPr>
+        <w:t>a</w:t>
+      </w:r>
+      <w:r>
+        <w:rPr>
+          <w:rFonts w:ascii="Times New Roman" w:hAnsi="Times New Roman" w:cs="Times New Roman"/>
+        </w:rPr>
+        <w:t>A</w:t>
+      </w:r>
+      <w:proofErr w:type="spellEnd"/>
+      <w:r>
+        <w:rPr>
+          <w:rFonts w:ascii="Times New Roman" w:hAnsi="Times New Roman" w:cs="Times New Roman"/>
+        </w:rPr>
+        <w:t xml:space="preserve"> | </w:t>
+      </w:r>
+      <w:proofErr w:type="spellStart"/>
+      <w:r>
+        <w:rPr>
+          <w:rFonts w:ascii="Times New Roman" w:hAnsi="Times New Roman" w:cs="Times New Roman"/>
+        </w:rPr>
+        <w:t>a</w:t>
+      </w:r>
+      <w:r>
+        <w:rPr>
+          <w:rFonts w:ascii="Times New Roman" w:hAnsi="Times New Roman" w:cs="Times New Roman"/>
+        </w:rPr>
+        <w:t>B</w:t>
+      </w:r>
+      <w:proofErr w:type="spellEnd"/>
+      <w:r>
+        <w:rPr>
+          <w:rFonts w:ascii="Times New Roman" w:hAnsi="Times New Roman" w:cs="Times New Roman"/>
+        </w:rPr>
+        <w:tab/>
+      </w:r>
+    </w:p>
+    <w:p>
+      <w:pPr>
+        <w:contextualSpacing/>
+        <w:rPr>
+          <w:rFonts w:ascii="Times New Roman" w:hAnsi="Times New Roman" w:cs="Times New Roman"/>
+        </w:rPr>
+      </w:pPr>
+      <w:r>
+        <w:rPr>
+          <w:rFonts w:ascii="Times New Roman" w:hAnsi="Times New Roman" w:cs="Times New Roman"/>
+        </w:rPr>
+        <w:t xml:space="preserve">B -&gt; </w:t>
+      </w:r>
+      <w:proofErr w:type="spellStart"/>
+      <w:r>
+        <w:rPr>
+          <w:rFonts w:ascii="Times New Roman" w:hAnsi="Times New Roman" w:cs="Times New Roman"/>
+        </w:rPr>
+        <w:t>bBc</w:t>
+      </w:r>
+      <w:proofErr w:type="spellEnd"/>
+      <w:r>
+        <w:rPr>
+          <w:rFonts w:ascii="Times New Roman" w:hAnsi="Times New Roman" w:cs="Times New Roman"/>
+        </w:rPr>
+        <w:t xml:space="preserve"> | λ</w:t>
+      </w:r>
+    </w:p>
+    <w:p>
+      <w:pPr>
+        <w:contextualSpacing/>
+        <w:rPr>
+          <w:rFonts w:ascii="Times New Roman" w:hAnsi="Times New Roman" w:cs="Times New Roman"/>
+        </w:rPr>
+      </w:pPr>
+      <w:r>
+        <w:rPr>
+          <w:rFonts w:ascii="Times New Roman" w:hAnsi="Times New Roman" w:cs="Times New Roman"/>
+        </w:rPr>
+        <w:t xml:space="preserve">C -&gt; </w:t>
+      </w:r>
+      <w:proofErr w:type="spellStart"/>
+      <w:r>
+        <w:rPr>
+          <w:rFonts w:ascii="Times New Roman" w:hAnsi="Times New Roman" w:cs="Times New Roman"/>
+        </w:rPr>
+        <w:t>aCc</w:t>
+      </w:r>
+      <w:proofErr w:type="spellEnd"/>
+      <w:r>
+        <w:rPr>
+          <w:rFonts w:ascii="Times New Roman" w:hAnsi="Times New Roman" w:cs="Times New Roman"/>
+        </w:rPr>
+        <w:t xml:space="preserve"> | D</w:t>
+      </w:r>
+    </w:p>
+    <w:p>
+      <w:pPr>
+        <w:contextualSpacing/>
+        <w:rPr>
+          <w:rFonts w:ascii="Times New Roman" w:hAnsi="Times New Roman" w:cs="Times New Roman"/>
+        </w:rPr>
+      </w:pPr>
+      <w:r>
+        <w:rPr>
+          <w:rFonts w:ascii="Times New Roman" w:hAnsi="Times New Roman" w:cs="Times New Roman"/>
+        </w:rPr>
+        <w:t xml:space="preserve">D -&gt; </w:t>
+      </w:r>
+      <w:proofErr w:type="spellStart"/>
+      <w:r>
+        <w:rPr>
+          <w:rFonts w:ascii="Times New Roman" w:hAnsi="Times New Roman" w:cs="Times New Roman"/>
+        </w:rPr>
+        <w:t>b</w:t>
+      </w:r>
+      <w:r>
+        <w:rPr>
+          <w:rFonts w:ascii="Times New Roman" w:hAnsi="Times New Roman" w:cs="Times New Roman"/>
+        </w:rPr>
+        <w:t>D</w:t>
+      </w:r>
+      <w:proofErr w:type="spellEnd"/>
+      <w:r>
+        <w:rPr>
+          <w:rFonts w:ascii="Times New Roman" w:hAnsi="Times New Roman" w:cs="Times New Roman"/>
+        </w:rPr>
+        <w:t xml:space="preserve"> | λ</w:t>
+      </w:r>
+    </w:p>
+    <w:p>
+      <w:pPr>
+        <w:contextualSpacing/>
+        <w:rPr>
+          <w:rFonts w:ascii="Times New Roman" w:hAnsi="Times New Roman" w:cs="Times New Roman"/>
+        </w:rPr>
+      </w:pPr>
+    </w:p>
+    <w:p>
+      <w:pPr>
+        <w:contextualSpacing/>
+        <w:rPr>
+          <w:rFonts w:ascii="Times New Roman" w:hAnsi="Times New Roman" w:cs="Times New Roman"/>
+        </w:rPr>
+      </w:pPr>
+      <w:r>
+        <w:rPr>
+          <w:rFonts w:ascii="Times New Roman" w:hAnsi="Times New Roman" w:cs="Times New Roman"/>
+        </w:rPr>
+        <w:t xml:space="preserve">U -&gt; H | </w:t>
+      </w:r>
+      <w:r>
+        <w:rPr>
+          <w:rFonts w:ascii="Times New Roman" w:hAnsi="Times New Roman" w:cs="Times New Roman"/>
+        </w:rPr>
+        <w:t>J</w:t>
+      </w:r>
+    </w:p>
+    <w:p>
+      <w:pPr>
+        <w:contextualSpacing/>
+        <w:rPr>
+          <w:rFonts w:ascii="Times New Roman" w:hAnsi="Times New Roman" w:cs="Times New Roman"/>
+        </w:rPr>
+      </w:pPr>
+      <w:r>
+        <w:rPr>
+          <w:rFonts w:ascii="Times New Roman" w:hAnsi="Times New Roman" w:cs="Times New Roman"/>
+        </w:rPr>
+        <w:t xml:space="preserve">H -&gt; </w:t>
+      </w:r>
+      <w:proofErr w:type="spellStart"/>
+      <w:r>
+        <w:rPr>
+          <w:rFonts w:ascii="Times New Roman" w:hAnsi="Times New Roman" w:cs="Times New Roman"/>
+        </w:rPr>
+        <w:t>aHc</w:t>
+      </w:r>
+      <w:proofErr w:type="spellEnd"/>
+      <w:r>
+        <w:rPr>
+          <w:rFonts w:ascii="Times New Roman" w:hAnsi="Times New Roman" w:cs="Times New Roman"/>
+        </w:rPr>
+        <w:t xml:space="preserve"> |</w:t>
+      </w:r>
+      <w:r>
+        <w:rPr>
+          <w:rFonts w:ascii="Times New Roman" w:hAnsi="Times New Roman" w:cs="Times New Roman"/>
+        </w:rPr>
+        <w:t xml:space="preserve"> </w:t>
+      </w:r>
+      <w:proofErr w:type="spellStart"/>
+      <w:r>
+        <w:rPr>
+          <w:rFonts w:ascii="Times New Roman" w:hAnsi="Times New Roman" w:cs="Times New Roman"/>
+        </w:rPr>
+        <w:t>Hc</w:t>
+      </w:r>
+      <w:proofErr w:type="spellEnd"/>
+      <w:r>
+        <w:rPr>
+          <w:rFonts w:ascii="Times New Roman" w:hAnsi="Times New Roman" w:cs="Times New Roman"/>
+        </w:rPr>
+        <w:t xml:space="preserve"> | c | </w:t>
+      </w:r>
+      <w:proofErr w:type="spellStart"/>
+      <w:r>
+        <w:rPr>
+          <w:rFonts w:ascii="Times New Roman" w:hAnsi="Times New Roman" w:cs="Times New Roman"/>
+        </w:rPr>
+        <w:t>Ic</w:t>
+      </w:r>
+      <w:proofErr w:type="spellEnd"/>
+    </w:p>
+    <w:p>
+      <w:pPr>
+        <w:contextualSpacing/>
+        <w:rPr>
+          <w:rFonts w:ascii="Times New Roman" w:hAnsi="Times New Roman" w:cs="Times New Roman"/>
+        </w:rPr>
+      </w:pPr>
+      <w:r>
+        <w:rPr>
+          <w:rFonts w:ascii="Times New Roman" w:hAnsi="Times New Roman" w:cs="Times New Roman"/>
+        </w:rPr>
+        <w:t xml:space="preserve">I -&gt; </w:t>
+      </w:r>
+      <w:proofErr w:type="spellStart"/>
+      <w:r>
+        <w:rPr>
+          <w:rFonts w:ascii="Times New Roman" w:hAnsi="Times New Roman" w:cs="Times New Roman"/>
+        </w:rPr>
+        <w:t>bI</w:t>
+      </w:r>
+      <w:r>
+        <w:rPr>
+          <w:rFonts w:ascii="Times New Roman" w:hAnsi="Times New Roman" w:cs="Times New Roman"/>
+        </w:rPr>
+        <w:t>c</w:t>
+      </w:r>
+      <w:proofErr w:type="spellEnd"/>
+      <w:r>
+        <w:rPr>
+          <w:rFonts w:ascii="Times New Roman" w:hAnsi="Times New Roman" w:cs="Times New Roman"/>
+        </w:rPr>
+        <w:t xml:space="preserve"> | λ</w:t>
+      </w:r>
+    </w:p>
+    <w:p>
+      <w:pPr>
+        <w:contextualSpacing/>
+        <w:rPr>
+          <w:rFonts w:ascii="Times New Roman" w:hAnsi="Times New Roman" w:cs="Times New Roman"/>
+        </w:rPr>
+      </w:pPr>
+      <w:r>
+        <w:rPr>
+          <w:rFonts w:ascii="Times New Roman" w:hAnsi="Times New Roman" w:cs="Times New Roman"/>
+        </w:rPr>
+        <w:t xml:space="preserve">J -&gt; </w:t>
+      </w:r>
+      <w:proofErr w:type="spellStart"/>
+      <w:r>
+        <w:rPr>
+          <w:rFonts w:ascii="Times New Roman" w:hAnsi="Times New Roman" w:cs="Times New Roman"/>
+        </w:rPr>
+        <w:t>a</w:t>
+      </w:r>
+      <w:r>
+        <w:rPr>
+          <w:rFonts w:ascii="Times New Roman" w:hAnsi="Times New Roman" w:cs="Times New Roman"/>
+        </w:rPr>
+        <w:t>Jc</w:t>
+      </w:r>
+      <w:proofErr w:type="spellEnd"/>
+      <w:r>
+        <w:rPr>
+          <w:rFonts w:ascii="Times New Roman" w:hAnsi="Times New Roman" w:cs="Times New Roman"/>
+        </w:rPr>
+        <w:t xml:space="preserve"> |</w:t>
+      </w:r>
+      <w:r>
+        <w:rPr>
+          <w:rFonts w:ascii="Times New Roman" w:hAnsi="Times New Roman" w:cs="Times New Roman"/>
+        </w:rPr>
+        <w:t xml:space="preserve"> K</w:t>
+      </w:r>
+    </w:p>
+    <w:p>
+      <w:pPr>
+        <w:contextualSpacing/>
+        <w:rPr>
+          <w:rFonts w:ascii="Times New Roman" w:hAnsi="Times New Roman" w:cs="Times New Roman"/>
+        </w:rPr>
+      </w:pPr>
+      <w:r>
+        <w:rPr>
+          <w:rFonts w:ascii="Times New Roman" w:hAnsi="Times New Roman" w:cs="Times New Roman"/>
+        </w:rPr>
+        <w:t xml:space="preserve">K -&gt; </w:t>
+      </w:r>
+      <w:proofErr w:type="spellStart"/>
+      <w:r>
+        <w:rPr>
+          <w:rFonts w:ascii="Times New Roman" w:hAnsi="Times New Roman" w:cs="Times New Roman"/>
+        </w:rPr>
+        <w:t>bKc</w:t>
+      </w:r>
+      <w:proofErr w:type="spellEnd"/>
+      <w:r>
+        <w:rPr>
+          <w:rFonts w:ascii="Times New Roman" w:hAnsi="Times New Roman" w:cs="Times New Roman"/>
+        </w:rPr>
+        <w:t xml:space="preserve"> | Kc | c</w:t>
+      </w:r>
+    </w:p>
+    <w:p>
+      <w:pPr>
+        <w:contextualSpacing/>
+        <w:rPr>
+          <w:rFonts w:ascii="Times New Roman" w:hAnsi="Times New Roman" w:cs="Times New Roman"/>
+        </w:rPr>
+      </w:pPr>
+    </w:p>
+    <w:p>
+      <w:pPr>
+        <w:contextualSpacing/>
+        <w:rPr>
+          <w:rFonts w:ascii="Times New Roman" w:hAnsi="Times New Roman" w:cs="Times New Roman"/>
+        </w:rPr>
+      </w:pPr>
+    </w:p>
+    <w:p>
+      <w:pPr>
+        <w:contextualSpacing/>
+        <w:rPr>
+          <w:rFonts w:ascii="Times New Roman" w:hAnsi="Times New Roman" w:cs="Times New Roman"/>
+          <w:b/>
+          <w:bCs/>
+        </w:rPr>
+      </w:pPr>
+      <w:r>
+        <w:rPr>
+          <w:rFonts w:ascii="Times New Roman" w:hAnsi="Times New Roman" w:cs="Times New Roman"/>
+          <w:b/>
+          <w:bCs/>
+        </w:rPr>
+        <w:t xml:space="preserve">15) Give a CFG for Σ = </w:t>
+      </w:r>
+      <w:proofErr w:type="gramStart"/>
+      <w:r>
+        <w:rPr>
+          <w:rFonts w:ascii="Times New Roman" w:hAnsi="Times New Roman" w:cs="Times New Roman"/>
+          <w:b/>
+          <w:bCs/>
+        </w:rPr>
+        <w:t xml:space="preserve">{ </w:t>
+      </w:r>
+      <w:proofErr w:type="spellStart"/>
+      <w:r>
+        <w:rPr>
+          <w:rFonts w:ascii="Times New Roman" w:hAnsi="Times New Roman" w:cs="Times New Roman"/>
+          <w:b/>
+          <w:bCs/>
+        </w:rPr>
+        <w:t>a</w:t>
+      </w:r>
+      <w:proofErr w:type="gramEnd"/>
+      <w:r>
+        <w:rPr>
+          <w:rFonts w:ascii="Times New Roman" w:hAnsi="Times New Roman" w:cs="Times New Roman"/>
+          <w:b/>
+          <w:bCs/>
+        </w:rPr>
         <w:t>,</w:t>
       </w:r>
       <w:proofErr w:type="gramStart"/>
@@ -1572,14 +2642,32 @@
           <w:b/>
           <w:bCs/>
         </w:rPr>
-        <w:t xml:space="preserve">* : </w:t>
-      </w:r>
-      <w:proofErr w:type="spellStart"/>
-      <w:r>
-        <w:rPr>
-          <w:rFonts w:ascii="Times New Roman" w:hAnsi="Times New Roman" w:cs="Times New Roman"/>
-          <w:b/>
-          <w:bCs/>
+        <w:t xml:space="preserve"> for the language L = </w:t>
+      </w:r>
+      <w:proofErr w:type="gramStart"/>
+      <w:r>
+        <w:rPr>
+          <w:rFonts w:ascii="Times New Roman" w:hAnsi="Times New Roman" w:cs="Times New Roman"/>
+          <w:b/>
+          <w:bCs/>
+        </w:rPr>
+        <w:t xml:space="preserve">{ </w:t>
+      </w:r>
+      <w:proofErr w:type="spellStart"/>
+      <w:r>
+        <w:rPr>
+          <w:rFonts w:ascii="Times New Roman" w:hAnsi="Times New Roman" w:cs="Times New Roman"/>
+          <w:b/>
+          <w:bCs/>
+        </w:rPr>
+        <w:t>a</w:t>
+      </w:r>
+      <w:r>
+        <w:rPr>
+          <w:rFonts w:ascii="Times New Roman" w:hAnsi="Times New Roman" w:cs="Times New Roman"/>
+          <w:b/>
+          <w:bCs/>
+          <w:vertAlign w:val="superscript"/>
         </w:rPr>
         <w:t>n</w:t>
       </w:r>
@@ -1588,25 +2676,23 @@
           <w:rFonts w:ascii="Times New Roman" w:hAnsi="Times New Roman" w:cs="Times New Roman"/>
           <w:b/>
           <w:bCs/>
-          <w:vertAlign w:val="subscript"/>
-        </w:rPr>
-        <w:t>a</w:t>
-      </w:r>
-      <w:proofErr w:type="spellEnd"/>
-      <w:r>
-        <w:rPr>
-          <w:rFonts w:ascii="Times New Roman" w:hAnsi="Times New Roman" w:cs="Times New Roman"/>
-          <w:b/>
-          <w:bCs/>
-        </w:rPr>
-        <w:t>(w) = 2n</w:t>
-      </w:r>
-      <w:r>
-        <w:rPr>
-          <w:rFonts w:ascii="Times New Roman" w:hAnsi="Times New Roman" w:cs="Times New Roman"/>
-          <w:b/>
-          <w:bCs/>
-          <w:vertAlign w:val="subscript"/>
+        </w:rPr>
+        <w:t>ww</w:t>
+      </w:r>
+      <w:r>
+        <w:rPr>
+          <w:rFonts w:ascii="Times New Roman" w:hAnsi="Times New Roman" w:cs="Times New Roman"/>
+          <w:b/>
+          <w:bCs/>
+          <w:vertAlign w:val="superscript"/>
+        </w:rPr>
+        <w:t>r</w:t>
+      </w:r>
+      <w:r>
+        <w:rPr>
+          <w:rFonts w:ascii="Times New Roman" w:hAnsi="Times New Roman" w:cs="Times New Roman"/>
+          <w:b/>
+          <w:bCs/>
         </w:rPr>
         <w:t>b</w:t>
       </w:r>
@@ -1615,8 +2701,19 @@
           <w:rFonts w:ascii="Times New Roman" w:hAnsi="Times New Roman" w:cs="Times New Roman"/>
           <w:b/>
           <w:bCs/>
-        </w:rPr>
-        <w:t xml:space="preserve">(w) + </w:t>
+          <w:vertAlign w:val="superscript"/>
+        </w:rPr>
+        <w:t>n</w:t>
+      </w:r>
+      <w:proofErr w:type="spellEnd"/>
+      <w:proofErr w:type="gramEnd"/>
+      <w:r>
+        <w:rPr>
+          <w:rFonts w:ascii="Times New Roman" w:hAnsi="Times New Roman" w:cs="Times New Roman"/>
+          <w:b/>
+          <w:bCs/>
+        </w:rPr>
+        <w:t xml:space="preserve"> : w ϵ Σ*, n ≥ </w:t>
       </w:r>
       <w:proofErr w:type="gramStart"/>
       <w:r>
@@ -1655,1085 +2752,44 @@
         <w:rPr>
           <w:rFonts w:ascii="Times New Roman" w:hAnsi="Times New Roman" w:cs="Times New Roman"/>
         </w:rPr>
+        <w:t>aTb</w:t>
+      </w:r>
+      <w:proofErr w:type="spellEnd"/>
+      <w:r>
+        <w:rPr>
+          <w:rFonts w:ascii="Times New Roman" w:hAnsi="Times New Roman" w:cs="Times New Roman"/>
+        </w:rPr>
+        <w:t xml:space="preserve"> | </w:t>
+      </w:r>
+      <w:proofErr w:type="spellStart"/>
+      <w:r>
+        <w:rPr>
+          <w:rFonts w:ascii="Times New Roman" w:hAnsi="Times New Roman" w:cs="Times New Roman"/>
+        </w:rPr>
+        <w:t>aSb</w:t>
+      </w:r>
+      <w:proofErr w:type="spellEnd"/>
+    </w:p>
+    <w:p>
+      <w:pPr>
+        <w:contextualSpacing/>
+        <w:rPr>
+          <w:rFonts w:ascii="Times New Roman" w:hAnsi="Times New Roman" w:cs="Times New Roman"/>
+        </w:rPr>
+      </w:pPr>
+      <w:proofErr w:type="spellStart"/>
+      <w:r>
+        <w:rPr>
+          <w:rFonts w:ascii="Times New Roman" w:hAnsi="Times New Roman" w:cs="Times New Roman"/>
+        </w:rPr>
         <w:t>T</w:t>
       </w:r>
-      <w:r>
-        <w:rPr>
-          <w:rFonts w:ascii="Times New Roman" w:hAnsi="Times New Roman" w:cs="Times New Roman"/>
-        </w:rPr>
-        <w:t>aT</w:t>
-      </w:r>
-      <w:proofErr w:type="spellEnd"/>
-    </w:p>
-    <w:p>
-      <w:pPr>
-        <w:contextualSpacing/>
-        <w:rPr>
-          <w:rFonts w:ascii="Times New Roman" w:hAnsi="Times New Roman" w:cs="Times New Roman"/>
-        </w:rPr>
-      </w:pPr>
-      <w:r>
-        <w:rPr>
-          <w:rFonts w:ascii="Times New Roman" w:hAnsi="Times New Roman" w:cs="Times New Roman"/>
-        </w:rPr>
-        <w:t xml:space="preserve">T -&gt; </w:t>
-      </w:r>
-      <w:proofErr w:type="spellStart"/>
-      <w:r>
-        <w:rPr>
-          <w:rFonts w:ascii="Times New Roman" w:hAnsi="Times New Roman" w:cs="Times New Roman"/>
-        </w:rPr>
-        <w:t>aabT</w:t>
-      </w:r>
-      <w:proofErr w:type="spellEnd"/>
-      <w:r>
-        <w:rPr>
-          <w:rFonts w:ascii="Times New Roman" w:hAnsi="Times New Roman" w:cs="Times New Roman"/>
-        </w:rPr>
-        <w:t xml:space="preserve"> | </w:t>
-      </w:r>
-      <w:proofErr w:type="spellStart"/>
-      <w:r>
-        <w:rPr>
-          <w:rFonts w:ascii="Times New Roman" w:hAnsi="Times New Roman" w:cs="Times New Roman"/>
-        </w:rPr>
-        <w:t>aaTb</w:t>
-      </w:r>
-      <w:proofErr w:type="spellEnd"/>
-      <w:r>
-        <w:rPr>
-          <w:rFonts w:ascii="Times New Roman" w:hAnsi="Times New Roman" w:cs="Times New Roman"/>
-        </w:rPr>
-        <w:t xml:space="preserve"> | </w:t>
-      </w:r>
-      <w:proofErr w:type="spellStart"/>
-      <w:r>
-        <w:rPr>
-          <w:rFonts w:ascii="Times New Roman" w:hAnsi="Times New Roman" w:cs="Times New Roman"/>
-        </w:rPr>
-        <w:t>aTab</w:t>
-      </w:r>
-      <w:proofErr w:type="spellEnd"/>
-      <w:r>
-        <w:rPr>
-          <w:rFonts w:ascii="Times New Roman" w:hAnsi="Times New Roman" w:cs="Times New Roman"/>
-        </w:rPr>
-        <w:t xml:space="preserve"> |</w:t>
-      </w:r>
-      <w:r>
-        <w:rPr>
-          <w:rFonts w:ascii="Times New Roman" w:hAnsi="Times New Roman" w:cs="Times New Roman"/>
-        </w:rPr>
-        <w:t xml:space="preserve"> Taab |</w:t>
-      </w:r>
-      <w:r>
-        <w:rPr>
-          <w:rFonts w:ascii="Times New Roman" w:hAnsi="Times New Roman" w:cs="Times New Roman"/>
-        </w:rPr>
-        <w:t xml:space="preserve"> </w:t>
-      </w:r>
-      <w:proofErr w:type="spellStart"/>
-      <w:r>
-        <w:rPr>
-          <w:rFonts w:ascii="Times New Roman" w:hAnsi="Times New Roman" w:cs="Times New Roman"/>
-        </w:rPr>
-        <w:t>aba</w:t>
-      </w:r>
-      <w:r>
-        <w:rPr>
-          <w:rFonts w:ascii="Times New Roman" w:hAnsi="Times New Roman" w:cs="Times New Roman"/>
-        </w:rPr>
-        <w:t>T</w:t>
-      </w:r>
-      <w:proofErr w:type="spellEnd"/>
-      <w:r>
-        <w:rPr>
-          <w:rFonts w:ascii="Times New Roman" w:hAnsi="Times New Roman" w:cs="Times New Roman"/>
-        </w:rPr>
-        <w:t xml:space="preserve"> | </w:t>
-      </w:r>
-      <w:proofErr w:type="spellStart"/>
-      <w:r>
-        <w:rPr>
-          <w:rFonts w:ascii="Times New Roman" w:hAnsi="Times New Roman" w:cs="Times New Roman"/>
-        </w:rPr>
-        <w:t>ab</w:t>
-      </w:r>
-      <w:r>
-        <w:rPr>
-          <w:rFonts w:ascii="Times New Roman" w:hAnsi="Times New Roman" w:cs="Times New Roman"/>
-        </w:rPr>
-        <w:t>T</w:t>
-      </w:r>
-      <w:r>
-        <w:rPr>
-          <w:rFonts w:ascii="Times New Roman" w:hAnsi="Times New Roman" w:cs="Times New Roman"/>
-        </w:rPr>
-        <w:t>a</w:t>
-      </w:r>
-      <w:proofErr w:type="spellEnd"/>
-      <w:r>
-        <w:rPr>
-          <w:rFonts w:ascii="Times New Roman" w:hAnsi="Times New Roman" w:cs="Times New Roman"/>
-        </w:rPr>
-        <w:t xml:space="preserve"> | </w:t>
-      </w:r>
-      <w:proofErr w:type="spellStart"/>
-      <w:r>
-        <w:rPr>
-          <w:rFonts w:ascii="Times New Roman" w:hAnsi="Times New Roman" w:cs="Times New Roman"/>
-        </w:rPr>
-        <w:t>a</w:t>
-      </w:r>
-      <w:r>
-        <w:rPr>
-          <w:rFonts w:ascii="Times New Roman" w:hAnsi="Times New Roman" w:cs="Times New Roman"/>
-        </w:rPr>
-        <w:t>T</w:t>
-      </w:r>
-      <w:r>
-        <w:rPr>
-          <w:rFonts w:ascii="Times New Roman" w:hAnsi="Times New Roman" w:cs="Times New Roman"/>
-        </w:rPr>
-        <w:t>ba</w:t>
-      </w:r>
-      <w:proofErr w:type="spellEnd"/>
-      <w:r>
-        <w:rPr>
-          <w:rFonts w:ascii="Times New Roman" w:hAnsi="Times New Roman" w:cs="Times New Roman"/>
-        </w:rPr>
-        <w:t xml:space="preserve"> | T</w:t>
-      </w:r>
-      <w:r>
-        <w:rPr>
-          <w:rFonts w:ascii="Times New Roman" w:hAnsi="Times New Roman" w:cs="Times New Roman"/>
-        </w:rPr>
-        <w:t>aba</w:t>
-      </w:r>
-      <w:r>
-        <w:rPr>
-          <w:rFonts w:ascii="Times New Roman" w:hAnsi="Times New Roman" w:cs="Times New Roman"/>
-        </w:rPr>
-        <w:t xml:space="preserve"> | </w:t>
-      </w:r>
-      <w:proofErr w:type="spellStart"/>
-      <w:r>
-        <w:rPr>
-          <w:rFonts w:ascii="Times New Roman" w:hAnsi="Times New Roman" w:cs="Times New Roman"/>
-        </w:rPr>
-        <w:t>baaT</w:t>
-      </w:r>
-      <w:proofErr w:type="spellEnd"/>
-      <w:r>
-        <w:rPr>
-          <w:rFonts w:ascii="Times New Roman" w:hAnsi="Times New Roman" w:cs="Times New Roman"/>
-        </w:rPr>
-        <w:t xml:space="preserve"> | </w:t>
-      </w:r>
-      <w:proofErr w:type="spellStart"/>
-      <w:r>
-        <w:rPr>
-          <w:rFonts w:ascii="Times New Roman" w:hAnsi="Times New Roman" w:cs="Times New Roman"/>
-        </w:rPr>
-        <w:t>baTa</w:t>
-      </w:r>
-      <w:proofErr w:type="spellEnd"/>
-      <w:r>
-        <w:rPr>
-          <w:rFonts w:ascii="Times New Roman" w:hAnsi="Times New Roman" w:cs="Times New Roman"/>
-        </w:rPr>
-        <w:t xml:space="preserve"> | </w:t>
-      </w:r>
-      <w:proofErr w:type="spellStart"/>
-      <w:r>
-        <w:rPr>
-          <w:rFonts w:ascii="Times New Roman" w:hAnsi="Times New Roman" w:cs="Times New Roman"/>
-        </w:rPr>
-        <w:t>bTaa</w:t>
-      </w:r>
-      <w:proofErr w:type="spellEnd"/>
-      <w:r>
-        <w:rPr>
-          <w:rFonts w:ascii="Times New Roman" w:hAnsi="Times New Roman" w:cs="Times New Roman"/>
-        </w:rPr>
-        <w:t xml:space="preserve"> | </w:t>
-      </w:r>
-      <w:proofErr w:type="spellStart"/>
-      <w:r>
-        <w:rPr>
-          <w:rFonts w:ascii="Times New Roman" w:hAnsi="Times New Roman" w:cs="Times New Roman"/>
-        </w:rPr>
-        <w:t>Tbaa</w:t>
-      </w:r>
-      <w:proofErr w:type="spellEnd"/>
-      <w:r>
-        <w:rPr>
-          <w:rFonts w:ascii="Times New Roman" w:hAnsi="Times New Roman" w:cs="Times New Roman"/>
-        </w:rPr>
-        <w:t xml:space="preserve"> | λ</w:t>
-      </w:r>
-    </w:p>
-    <w:p>
-      <w:pPr>
-        <w:contextualSpacing/>
-        <w:rPr>
-          <w:rFonts w:ascii="Times New Roman" w:hAnsi="Times New Roman" w:cs="Times New Roman"/>
-        </w:rPr>
-      </w:pPr>
-    </w:p>
-    <w:p>
-      <w:pPr>
-        <w:contextualSpacing/>
-        <w:rPr>
-          <w:rFonts w:ascii="Times New Roman" w:hAnsi="Times New Roman" w:cs="Times New Roman"/>
-        </w:rPr>
-      </w:pPr>
-    </w:p>
-    <w:p>
-      <w:pPr>
-        <w:contextualSpacing/>
-        <w:rPr>
-          <w:rFonts w:ascii="Times New Roman" w:hAnsi="Times New Roman" w:cs="Times New Roman"/>
-          <w:b/>
-          <w:bCs/>
-        </w:rPr>
-      </w:pPr>
-      <w:r>
-        <w:rPr>
-          <w:rFonts w:ascii="Times New Roman" w:hAnsi="Times New Roman" w:cs="Times New Roman"/>
-          <w:b/>
-          <w:bCs/>
-        </w:rPr>
-        <w:t>12) Find CFGs for the following languages</w:t>
-      </w:r>
-    </w:p>
-    <w:p>
-      <w:pPr>
-        <w:contextualSpacing/>
-        <w:rPr>
-          <w:rFonts w:ascii="Times New Roman" w:hAnsi="Times New Roman" w:cs="Times New Roman"/>
-        </w:rPr>
-      </w:pPr>
-      <w:r>
-        <w:rPr>
-          <w:rFonts w:ascii="Times New Roman" w:hAnsi="Times New Roman" w:cs="Times New Roman"/>
-          <w:b/>
-          <w:bCs/>
-        </w:rPr>
-        <w:t xml:space="preserve">c) L = </w:t>
-      </w:r>
-      <w:proofErr w:type="gramStart"/>
-      <w:r>
-        <w:rPr>
-          <w:rFonts w:ascii="Times New Roman" w:hAnsi="Times New Roman" w:cs="Times New Roman"/>
-          <w:b/>
-          <w:bCs/>
-        </w:rPr>
-        <w:t xml:space="preserve">{ </w:t>
-      </w:r>
-      <w:proofErr w:type="spellStart"/>
-      <w:r>
-        <w:rPr>
-          <w:rFonts w:ascii="Times New Roman" w:hAnsi="Times New Roman" w:cs="Times New Roman"/>
-          <w:b/>
-          <w:bCs/>
-        </w:rPr>
-        <w:t>a</w:t>
-      </w:r>
-      <w:r>
-        <w:rPr>
-          <w:rFonts w:ascii="Times New Roman" w:hAnsi="Times New Roman" w:cs="Times New Roman"/>
-          <w:b/>
-          <w:bCs/>
-          <w:vertAlign w:val="superscript"/>
-        </w:rPr>
-        <w:t>n</w:t>
-      </w:r>
-      <w:r>
-        <w:rPr>
-          <w:rFonts w:ascii="Times New Roman" w:hAnsi="Times New Roman" w:cs="Times New Roman"/>
-          <w:b/>
-          <w:bCs/>
-        </w:rPr>
-        <w:t>b</w:t>
-      </w:r>
-      <w:r>
-        <w:rPr>
-          <w:rFonts w:ascii="Times New Roman" w:hAnsi="Times New Roman" w:cs="Times New Roman"/>
-          <w:b/>
-          <w:bCs/>
-          <w:vertAlign w:val="superscript"/>
-        </w:rPr>
-        <w:t>m</w:t>
-      </w:r>
-      <w:r>
-        <w:rPr>
-          <w:rFonts w:ascii="Times New Roman" w:hAnsi="Times New Roman" w:cs="Times New Roman"/>
-          <w:b/>
-          <w:bCs/>
-        </w:rPr>
-        <w:t>c</w:t>
-      </w:r>
-      <w:r>
-        <w:rPr>
-          <w:rFonts w:ascii="Times New Roman" w:hAnsi="Times New Roman" w:cs="Times New Roman"/>
-          <w:b/>
-          <w:bCs/>
-          <w:vertAlign w:val="superscript"/>
-        </w:rPr>
-        <w:t>k</w:t>
-      </w:r>
-      <w:proofErr w:type="spellEnd"/>
-      <w:proofErr w:type="gramEnd"/>
-      <w:r>
-        <w:rPr>
-          <w:rFonts w:ascii="Times New Roman" w:hAnsi="Times New Roman" w:cs="Times New Roman"/>
-          <w:b/>
-          <w:bCs/>
-        </w:rPr>
-        <w:t xml:space="preserve">, k = n + </w:t>
-      </w:r>
-      <w:proofErr w:type="gramStart"/>
-      <w:r>
-        <w:rPr>
-          <w:rFonts w:ascii="Times New Roman" w:hAnsi="Times New Roman" w:cs="Times New Roman"/>
-          <w:b/>
-          <w:bCs/>
-        </w:rPr>
-        <w:t>m }</w:t>
-      </w:r>
-      <w:proofErr w:type="gramEnd"/>
-    </w:p>
-    <w:p>
-      <w:pPr>
-        <w:contextualSpacing/>
-        <w:rPr>
-          <w:rFonts w:ascii="Times New Roman" w:hAnsi="Times New Roman" w:cs="Times New Roman"/>
-        </w:rPr>
-      </w:pPr>
-    </w:p>
-    <w:p>
-      <w:pPr>
-        <w:contextualSpacing/>
-        <w:rPr>
-          <w:rFonts w:ascii="Times New Roman" w:hAnsi="Times New Roman" w:cs="Times New Roman"/>
-        </w:rPr>
-      </w:pPr>
-      <w:r>
-        <w:rPr>
-          <w:rFonts w:ascii="Times New Roman" w:hAnsi="Times New Roman" w:cs="Times New Roman"/>
-        </w:rPr>
-        <w:t xml:space="preserve">S -&gt; </w:t>
-      </w:r>
-      <w:proofErr w:type="spellStart"/>
-      <w:r>
-        <w:rPr>
-          <w:rFonts w:ascii="Times New Roman" w:hAnsi="Times New Roman" w:cs="Times New Roman"/>
-        </w:rPr>
-        <w:t>aSc</w:t>
-      </w:r>
-      <w:proofErr w:type="spellEnd"/>
-      <w:r>
-        <w:rPr>
-          <w:rFonts w:ascii="Times New Roman" w:hAnsi="Times New Roman" w:cs="Times New Roman"/>
-        </w:rPr>
-        <w:t xml:space="preserve"> | T</w:t>
-      </w:r>
-    </w:p>
-    <w:p>
-      <w:pPr>
-        <w:contextualSpacing/>
-        <w:rPr>
-          <w:rFonts w:ascii="Times New Roman" w:hAnsi="Times New Roman" w:cs="Times New Roman"/>
-        </w:rPr>
-      </w:pPr>
-      <w:r>
-        <w:rPr>
-          <w:rFonts w:ascii="Times New Roman" w:hAnsi="Times New Roman" w:cs="Times New Roman"/>
-        </w:rPr>
-        <w:t xml:space="preserve">T -&gt; </w:t>
-      </w:r>
-      <w:proofErr w:type="spellStart"/>
-      <w:r>
-        <w:rPr>
-          <w:rFonts w:ascii="Times New Roman" w:hAnsi="Times New Roman" w:cs="Times New Roman"/>
-        </w:rPr>
-        <w:t>b</w:t>
-      </w:r>
-      <w:r>
-        <w:rPr>
-          <w:rFonts w:ascii="Times New Roman" w:hAnsi="Times New Roman" w:cs="Times New Roman"/>
-        </w:rPr>
-        <w:t>T</w:t>
-      </w:r>
-      <w:r>
-        <w:rPr>
-          <w:rFonts w:ascii="Times New Roman" w:hAnsi="Times New Roman" w:cs="Times New Roman"/>
-        </w:rPr>
-        <w:t>c</w:t>
-      </w:r>
-      <w:proofErr w:type="spellEnd"/>
-      <w:r>
-        <w:rPr>
-          <w:rFonts w:ascii="Times New Roman" w:hAnsi="Times New Roman" w:cs="Times New Roman"/>
-        </w:rPr>
-        <w:t xml:space="preserve"> | λ</w:t>
-      </w:r>
-    </w:p>
-    <w:p>
-      <w:pPr>
-        <w:contextualSpacing/>
-        <w:rPr>
-          <w:rFonts w:ascii="Times New Roman" w:hAnsi="Times New Roman" w:cs="Times New Roman"/>
-        </w:rPr>
-      </w:pPr>
-    </w:p>
-    <w:p>
-      <w:pPr>
-        <w:contextualSpacing/>
-        <w:rPr>
-          <w:rFonts w:ascii="Times New Roman" w:hAnsi="Times New Roman" w:cs="Times New Roman"/>
-        </w:rPr>
-      </w:pPr>
-    </w:p>
-    <w:p>
-      <w:pPr>
-        <w:contextualSpacing/>
-        <w:rPr>
-          <w:rFonts w:ascii="Times New Roman" w:hAnsi="Times New Roman" w:cs="Times New Roman"/>
-          <w:b/>
-          <w:bCs/>
-        </w:rPr>
-      </w:pPr>
-      <w:r>
-        <w:rPr>
-          <w:rFonts w:ascii="Times New Roman" w:hAnsi="Times New Roman" w:cs="Times New Roman"/>
-          <w:b/>
-          <w:bCs/>
-        </w:rPr>
-        <w:t xml:space="preserve">f) L = </w:t>
-      </w:r>
-      <w:proofErr w:type="gramStart"/>
-      <w:r>
-        <w:rPr>
-          <w:rFonts w:ascii="Times New Roman" w:hAnsi="Times New Roman" w:cs="Times New Roman"/>
-          <w:b/>
-          <w:bCs/>
-        </w:rPr>
-        <w:t xml:space="preserve">{ </w:t>
-      </w:r>
-      <w:proofErr w:type="spellStart"/>
-      <w:r>
-        <w:rPr>
-          <w:rFonts w:ascii="Times New Roman" w:hAnsi="Times New Roman" w:cs="Times New Roman"/>
-          <w:b/>
-          <w:bCs/>
-        </w:rPr>
-        <w:t>a</w:t>
-      </w:r>
-      <w:r>
-        <w:rPr>
-          <w:rFonts w:ascii="Times New Roman" w:hAnsi="Times New Roman" w:cs="Times New Roman"/>
-          <w:b/>
-          <w:bCs/>
-          <w:vertAlign w:val="superscript"/>
-        </w:rPr>
-        <w:t>n</w:t>
-      </w:r>
-      <w:r>
-        <w:rPr>
-          <w:rFonts w:ascii="Times New Roman" w:hAnsi="Times New Roman" w:cs="Times New Roman"/>
-          <w:b/>
-          <w:bCs/>
-        </w:rPr>
-        <w:t>b</w:t>
-      </w:r>
-      <w:r>
-        <w:rPr>
-          <w:rFonts w:ascii="Times New Roman" w:hAnsi="Times New Roman" w:cs="Times New Roman"/>
-          <w:b/>
-          <w:bCs/>
-          <w:vertAlign w:val="superscript"/>
-        </w:rPr>
-        <w:t>m</w:t>
-      </w:r>
-      <w:r>
-        <w:rPr>
-          <w:rFonts w:ascii="Times New Roman" w:hAnsi="Times New Roman" w:cs="Times New Roman"/>
-          <w:b/>
-          <w:bCs/>
-        </w:rPr>
-        <w:t>c</w:t>
-      </w:r>
-      <w:r>
-        <w:rPr>
-          <w:rFonts w:ascii="Times New Roman" w:hAnsi="Times New Roman" w:cs="Times New Roman"/>
-          <w:b/>
-          <w:bCs/>
-          <w:vertAlign w:val="superscript"/>
-        </w:rPr>
-        <w:t>k</w:t>
-      </w:r>
-      <w:proofErr w:type="spellEnd"/>
-      <w:proofErr w:type="gramEnd"/>
-      <w:r>
-        <w:rPr>
-          <w:rFonts w:ascii="Times New Roman" w:hAnsi="Times New Roman" w:cs="Times New Roman"/>
-          <w:b/>
-          <w:bCs/>
-        </w:rPr>
-        <w:t xml:space="preserve">, k ≠ n + </w:t>
-      </w:r>
-      <w:proofErr w:type="gramStart"/>
-      <w:r>
-        <w:rPr>
-          <w:rFonts w:ascii="Times New Roman" w:hAnsi="Times New Roman" w:cs="Times New Roman"/>
-          <w:b/>
-          <w:bCs/>
-        </w:rPr>
-        <w:t>m }</w:t>
-      </w:r>
-      <w:proofErr w:type="gramEnd"/>
-    </w:p>
-    <w:p>
-      <w:pPr>
-        <w:contextualSpacing/>
-        <w:rPr>
-          <w:rFonts w:ascii="Times New Roman" w:hAnsi="Times New Roman" w:cs="Times New Roman"/>
-        </w:rPr>
-      </w:pPr>
-    </w:p>
-    <w:p>
-      <w:pPr>
-        <w:contextualSpacing/>
-        <w:rPr>
-          <w:rFonts w:ascii="Times New Roman" w:hAnsi="Times New Roman" w:cs="Times New Roman"/>
-        </w:rPr>
-      </w:pPr>
-      <w:r>
-        <w:rPr>
-          <w:rFonts w:ascii="Times New Roman" w:hAnsi="Times New Roman" w:cs="Times New Roman"/>
-        </w:rPr>
-        <w:t>S -&gt; T | U</w:t>
-      </w:r>
-    </w:p>
-    <w:p>
-      <w:pPr>
-        <w:contextualSpacing/>
-        <w:rPr>
-          <w:rFonts w:ascii="Times New Roman" w:hAnsi="Times New Roman" w:cs="Times New Roman"/>
-        </w:rPr>
-      </w:pPr>
-    </w:p>
-    <w:p>
-      <w:pPr>
-        <w:contextualSpacing/>
-        <w:rPr>
-          <w:rFonts w:ascii="Times New Roman" w:hAnsi="Times New Roman" w:cs="Times New Roman"/>
-        </w:rPr>
-      </w:pPr>
-      <w:r>
-        <w:rPr>
-          <w:rFonts w:ascii="Times New Roman" w:hAnsi="Times New Roman" w:cs="Times New Roman"/>
-        </w:rPr>
-        <w:t>T -&gt; A | C</w:t>
-      </w:r>
-    </w:p>
-    <w:p>
-      <w:pPr>
-        <w:contextualSpacing/>
-        <w:rPr>
-          <w:rFonts w:ascii="Times New Roman" w:hAnsi="Times New Roman" w:cs="Times New Roman"/>
-        </w:rPr>
-      </w:pPr>
-      <w:r>
-        <w:rPr>
-          <w:rFonts w:ascii="Times New Roman" w:hAnsi="Times New Roman" w:cs="Times New Roman"/>
-        </w:rPr>
-        <w:t xml:space="preserve">A -&gt; </w:t>
-      </w:r>
-      <w:proofErr w:type="spellStart"/>
-      <w:r>
-        <w:rPr>
-          <w:rFonts w:ascii="Times New Roman" w:hAnsi="Times New Roman" w:cs="Times New Roman"/>
-        </w:rPr>
-        <w:t>aaAc</w:t>
-      </w:r>
-      <w:proofErr w:type="spellEnd"/>
-      <w:r>
-        <w:rPr>
-          <w:rFonts w:ascii="Times New Roman" w:hAnsi="Times New Roman" w:cs="Times New Roman"/>
-        </w:rPr>
-        <w:t xml:space="preserve"> | B</w:t>
-      </w:r>
-    </w:p>
-    <w:p>
-      <w:pPr>
-        <w:contextualSpacing/>
-        <w:rPr>
-          <w:rFonts w:ascii="Times New Roman" w:hAnsi="Times New Roman" w:cs="Times New Roman"/>
-        </w:rPr>
-      </w:pPr>
-      <w:r>
-        <w:rPr>
-          <w:rFonts w:ascii="Times New Roman" w:hAnsi="Times New Roman" w:cs="Times New Roman"/>
-        </w:rPr>
-        <w:t xml:space="preserve">B -&gt; </w:t>
-      </w:r>
-      <w:proofErr w:type="spellStart"/>
-      <w:r>
-        <w:rPr>
-          <w:rFonts w:ascii="Times New Roman" w:hAnsi="Times New Roman" w:cs="Times New Roman"/>
-        </w:rPr>
-        <w:t>bBc</w:t>
-      </w:r>
-      <w:proofErr w:type="spellEnd"/>
-      <w:r>
-        <w:rPr>
-          <w:rFonts w:ascii="Times New Roman" w:hAnsi="Times New Roman" w:cs="Times New Roman"/>
-        </w:rPr>
-        <w:t xml:space="preserve"> | λ</w:t>
-      </w:r>
-    </w:p>
-    <w:p>
-      <w:pPr>
-        <w:contextualSpacing/>
-        <w:rPr>
-          <w:rFonts w:ascii="Times New Roman" w:hAnsi="Times New Roman" w:cs="Times New Roman"/>
-        </w:rPr>
-      </w:pPr>
-      <w:r>
-        <w:rPr>
-          <w:rFonts w:ascii="Times New Roman" w:hAnsi="Times New Roman" w:cs="Times New Roman"/>
-        </w:rPr>
-        <w:t xml:space="preserve">C -&gt; </w:t>
-      </w:r>
-      <w:proofErr w:type="spellStart"/>
-      <w:r>
-        <w:rPr>
-          <w:rFonts w:ascii="Times New Roman" w:hAnsi="Times New Roman" w:cs="Times New Roman"/>
-        </w:rPr>
-        <w:t>aCc</w:t>
-      </w:r>
-      <w:proofErr w:type="spellEnd"/>
-      <w:r>
-        <w:rPr>
-          <w:rFonts w:ascii="Times New Roman" w:hAnsi="Times New Roman" w:cs="Times New Roman"/>
-        </w:rPr>
-        <w:t xml:space="preserve"> | D</w:t>
-      </w:r>
-    </w:p>
-    <w:p>
-      <w:pPr>
-        <w:contextualSpacing/>
-        <w:rPr>
-          <w:rFonts w:ascii="Times New Roman" w:hAnsi="Times New Roman" w:cs="Times New Roman"/>
-        </w:rPr>
-      </w:pPr>
-      <w:r>
-        <w:rPr>
-          <w:rFonts w:ascii="Times New Roman" w:hAnsi="Times New Roman" w:cs="Times New Roman"/>
-        </w:rPr>
-        <w:t xml:space="preserve">D -&gt; </w:t>
-      </w:r>
-      <w:proofErr w:type="spellStart"/>
-      <w:r>
-        <w:rPr>
-          <w:rFonts w:ascii="Times New Roman" w:hAnsi="Times New Roman" w:cs="Times New Roman"/>
-        </w:rPr>
-        <w:t>bbDc</w:t>
-      </w:r>
-      <w:proofErr w:type="spellEnd"/>
-      <w:r>
-        <w:rPr>
-          <w:rFonts w:ascii="Times New Roman" w:hAnsi="Times New Roman" w:cs="Times New Roman"/>
-        </w:rPr>
-        <w:t xml:space="preserve"> | λ</w:t>
-      </w:r>
-    </w:p>
-    <w:p>
-      <w:pPr>
-        <w:contextualSpacing/>
-        <w:rPr>
-          <w:rFonts w:ascii="Times New Roman" w:hAnsi="Times New Roman" w:cs="Times New Roman"/>
-        </w:rPr>
-      </w:pPr>
-    </w:p>
-    <w:p>
-      <w:pPr>
-        <w:contextualSpacing/>
-        <w:rPr>
-          <w:rFonts w:ascii="Times New Roman" w:hAnsi="Times New Roman" w:cs="Times New Roman"/>
-        </w:rPr>
-      </w:pPr>
-      <w:r>
-        <w:rPr>
-          <w:rFonts w:ascii="Times New Roman" w:hAnsi="Times New Roman" w:cs="Times New Roman"/>
-        </w:rPr>
-        <w:t xml:space="preserve">U -&gt; H | </w:t>
-      </w:r>
-      <w:r>
-        <w:rPr>
-          <w:rFonts w:ascii="Times New Roman" w:hAnsi="Times New Roman" w:cs="Times New Roman"/>
-        </w:rPr>
-        <w:t>J</w:t>
-      </w:r>
-    </w:p>
-    <w:p>
-      <w:pPr>
-        <w:contextualSpacing/>
-        <w:rPr>
-          <w:rFonts w:ascii="Times New Roman" w:hAnsi="Times New Roman" w:cs="Times New Roman"/>
-        </w:rPr>
-      </w:pPr>
-      <w:r>
-        <w:rPr>
-          <w:rFonts w:ascii="Times New Roman" w:hAnsi="Times New Roman" w:cs="Times New Roman"/>
-        </w:rPr>
-        <w:t xml:space="preserve">H -&gt; </w:t>
-      </w:r>
-      <w:proofErr w:type="spellStart"/>
-      <w:r>
-        <w:rPr>
-          <w:rFonts w:ascii="Times New Roman" w:hAnsi="Times New Roman" w:cs="Times New Roman"/>
-        </w:rPr>
-        <w:t>aHcc</w:t>
-      </w:r>
-      <w:proofErr w:type="spellEnd"/>
-      <w:r>
-        <w:rPr>
-          <w:rFonts w:ascii="Times New Roman" w:hAnsi="Times New Roman" w:cs="Times New Roman"/>
-        </w:rPr>
-        <w:t xml:space="preserve"> | I</w:t>
-      </w:r>
-    </w:p>
-    <w:p>
-      <w:pPr>
-        <w:contextualSpacing/>
-        <w:rPr>
-          <w:rFonts w:ascii="Times New Roman" w:hAnsi="Times New Roman" w:cs="Times New Roman"/>
-        </w:rPr>
-      </w:pPr>
-      <w:r>
-        <w:rPr>
-          <w:rFonts w:ascii="Times New Roman" w:hAnsi="Times New Roman" w:cs="Times New Roman"/>
-        </w:rPr>
-        <w:t xml:space="preserve">I -&gt; </w:t>
-      </w:r>
-      <w:proofErr w:type="spellStart"/>
-      <w:r>
-        <w:rPr>
-          <w:rFonts w:ascii="Times New Roman" w:hAnsi="Times New Roman" w:cs="Times New Roman"/>
-        </w:rPr>
-        <w:t>bI</w:t>
-      </w:r>
-      <w:r>
-        <w:rPr>
-          <w:rFonts w:ascii="Times New Roman" w:hAnsi="Times New Roman" w:cs="Times New Roman"/>
-        </w:rPr>
-        <w:t>c</w:t>
-      </w:r>
-      <w:proofErr w:type="spellEnd"/>
-      <w:r>
-        <w:rPr>
-          <w:rFonts w:ascii="Times New Roman" w:hAnsi="Times New Roman" w:cs="Times New Roman"/>
-        </w:rPr>
-        <w:t xml:space="preserve"> | λ</w:t>
-      </w:r>
-    </w:p>
-    <w:p>
-      <w:pPr>
-        <w:contextualSpacing/>
-        <w:rPr>
-          <w:rFonts w:ascii="Times New Roman" w:hAnsi="Times New Roman" w:cs="Times New Roman"/>
-        </w:rPr>
-      </w:pPr>
-      <w:r>
-        <w:rPr>
-          <w:rFonts w:ascii="Times New Roman" w:hAnsi="Times New Roman" w:cs="Times New Roman"/>
-        </w:rPr>
-        <w:t xml:space="preserve">J -&gt; </w:t>
-      </w:r>
-      <w:proofErr w:type="spellStart"/>
-      <w:r>
-        <w:rPr>
-          <w:rFonts w:ascii="Times New Roman" w:hAnsi="Times New Roman" w:cs="Times New Roman"/>
-        </w:rPr>
-        <w:t>a</w:t>
-      </w:r>
-      <w:r>
-        <w:rPr>
-          <w:rFonts w:ascii="Times New Roman" w:hAnsi="Times New Roman" w:cs="Times New Roman"/>
-        </w:rPr>
-        <w:t>Jc</w:t>
-      </w:r>
-      <w:proofErr w:type="spellEnd"/>
-      <w:r>
-        <w:rPr>
-          <w:rFonts w:ascii="Times New Roman" w:hAnsi="Times New Roman" w:cs="Times New Roman"/>
-        </w:rPr>
-        <w:t xml:space="preserve"> |</w:t>
-      </w:r>
-      <w:r>
-        <w:rPr>
-          <w:rFonts w:ascii="Times New Roman" w:hAnsi="Times New Roman" w:cs="Times New Roman"/>
-        </w:rPr>
-        <w:t xml:space="preserve"> K</w:t>
-      </w:r>
-    </w:p>
-    <w:p>
-      <w:pPr>
-        <w:contextualSpacing/>
-        <w:rPr>
-          <w:rFonts w:ascii="Times New Roman" w:hAnsi="Times New Roman" w:cs="Times New Roman"/>
-        </w:rPr>
-      </w:pPr>
-      <w:r>
-        <w:rPr>
-          <w:rFonts w:ascii="Times New Roman" w:hAnsi="Times New Roman" w:cs="Times New Roman"/>
-        </w:rPr>
-        <w:t xml:space="preserve">K -&gt; </w:t>
-      </w:r>
-      <w:proofErr w:type="spellStart"/>
-      <w:r>
-        <w:rPr>
-          <w:rFonts w:ascii="Times New Roman" w:hAnsi="Times New Roman" w:cs="Times New Roman"/>
-        </w:rPr>
-        <w:t>bKcc</w:t>
-      </w:r>
-      <w:proofErr w:type="spellEnd"/>
-      <w:r>
-        <w:rPr>
-          <w:rFonts w:ascii="Times New Roman" w:hAnsi="Times New Roman" w:cs="Times New Roman"/>
-        </w:rPr>
-        <w:t xml:space="preserve"> | λ</w:t>
-      </w:r>
-    </w:p>
-    <w:p>
-      <w:pPr>
-        <w:contextualSpacing/>
-        <w:rPr>
-          <w:rFonts w:ascii="Times New Roman" w:hAnsi="Times New Roman" w:cs="Times New Roman"/>
-        </w:rPr>
-      </w:pPr>
-    </w:p>
-    <w:p>
-      <w:pPr>
-        <w:contextualSpacing/>
-        <w:rPr>
-          <w:rFonts w:ascii="Times New Roman" w:hAnsi="Times New Roman" w:cs="Times New Roman"/>
-        </w:rPr>
-      </w:pPr>
-    </w:p>
-    <w:p>
-      <w:pPr>
-        <w:contextualSpacing/>
-        <w:rPr>
-          <w:rFonts w:ascii="Times New Roman" w:hAnsi="Times New Roman" w:cs="Times New Roman"/>
-          <w:b/>
-          <w:bCs/>
-        </w:rPr>
-      </w:pPr>
-      <w:r>
-        <w:rPr>
-          <w:rFonts w:ascii="Times New Roman" w:hAnsi="Times New Roman" w:cs="Times New Roman"/>
-          <w:b/>
-          <w:bCs/>
-        </w:rPr>
-        <w:t xml:space="preserve">15) Give a CFG for Σ = </w:t>
-      </w:r>
-      <w:proofErr w:type="gramStart"/>
-      <w:r>
-        <w:rPr>
-          <w:rFonts w:ascii="Times New Roman" w:hAnsi="Times New Roman" w:cs="Times New Roman"/>
-          <w:b/>
-          <w:bCs/>
-        </w:rPr>
-        <w:t xml:space="preserve">{ </w:t>
-      </w:r>
-      <w:proofErr w:type="spellStart"/>
-      <w:r>
-        <w:rPr>
-          <w:rFonts w:ascii="Times New Roman" w:hAnsi="Times New Roman" w:cs="Times New Roman"/>
-          <w:b/>
-          <w:bCs/>
-        </w:rPr>
-        <w:t>a</w:t>
-      </w:r>
-      <w:proofErr w:type="gramEnd"/>
-      <w:r>
-        <w:rPr>
-          <w:rFonts w:ascii="Times New Roman" w:hAnsi="Times New Roman" w:cs="Times New Roman"/>
-          <w:b/>
-          <w:bCs/>
-        </w:rPr>
-        <w:t>,</w:t>
-      </w:r>
-      <w:proofErr w:type="gramStart"/>
-      <w:r>
-        <w:rPr>
-          <w:rFonts w:ascii="Times New Roman" w:hAnsi="Times New Roman" w:cs="Times New Roman"/>
-          <w:b/>
-          <w:bCs/>
-        </w:rPr>
-        <w:t>b</w:t>
-      </w:r>
-      <w:proofErr w:type="spellEnd"/>
-      <w:r>
-        <w:rPr>
-          <w:rFonts w:ascii="Times New Roman" w:hAnsi="Times New Roman" w:cs="Times New Roman"/>
-          <w:b/>
-          <w:bCs/>
-        </w:rPr>
-        <w:t xml:space="preserve"> }</w:t>
-      </w:r>
-      <w:proofErr w:type="gramEnd"/>
-      <w:r>
-        <w:rPr>
-          <w:rFonts w:ascii="Times New Roman" w:hAnsi="Times New Roman" w:cs="Times New Roman"/>
-          <w:b/>
-          <w:bCs/>
-        </w:rPr>
-        <w:t xml:space="preserve"> for the language L = </w:t>
-      </w:r>
-      <w:proofErr w:type="gramStart"/>
-      <w:r>
-        <w:rPr>
-          <w:rFonts w:ascii="Times New Roman" w:hAnsi="Times New Roman" w:cs="Times New Roman"/>
-          <w:b/>
-          <w:bCs/>
-        </w:rPr>
-        <w:t xml:space="preserve">{ </w:t>
-      </w:r>
-      <w:proofErr w:type="spellStart"/>
-      <w:r>
-        <w:rPr>
-          <w:rFonts w:ascii="Times New Roman" w:hAnsi="Times New Roman" w:cs="Times New Roman"/>
-          <w:b/>
-          <w:bCs/>
-        </w:rPr>
-        <w:t>a</w:t>
-      </w:r>
-      <w:r>
-        <w:rPr>
-          <w:rFonts w:ascii="Times New Roman" w:hAnsi="Times New Roman" w:cs="Times New Roman"/>
-          <w:b/>
-          <w:bCs/>
-          <w:vertAlign w:val="superscript"/>
-        </w:rPr>
-        <w:t>n</w:t>
-      </w:r>
-      <w:r>
-        <w:rPr>
-          <w:rFonts w:ascii="Times New Roman" w:hAnsi="Times New Roman" w:cs="Times New Roman"/>
-          <w:b/>
-          <w:bCs/>
-        </w:rPr>
-        <w:t>ww</w:t>
-      </w:r>
-      <w:r>
-        <w:rPr>
-          <w:rFonts w:ascii="Times New Roman" w:hAnsi="Times New Roman" w:cs="Times New Roman"/>
-          <w:b/>
-          <w:bCs/>
-          <w:vertAlign w:val="superscript"/>
-        </w:rPr>
-        <w:t>r</w:t>
-      </w:r>
-      <w:r>
-        <w:rPr>
-          <w:rFonts w:ascii="Times New Roman" w:hAnsi="Times New Roman" w:cs="Times New Roman"/>
-          <w:b/>
-          <w:bCs/>
-        </w:rPr>
-        <w:t>b</w:t>
-      </w:r>
-      <w:r>
-        <w:rPr>
-          <w:rFonts w:ascii="Times New Roman" w:hAnsi="Times New Roman" w:cs="Times New Roman"/>
-          <w:b/>
-          <w:bCs/>
-          <w:vertAlign w:val="superscript"/>
-        </w:rPr>
-        <w:t>n</w:t>
-      </w:r>
-      <w:proofErr w:type="spellEnd"/>
-      <w:proofErr w:type="gramEnd"/>
-      <w:r>
-        <w:rPr>
-          <w:rFonts w:ascii="Times New Roman" w:hAnsi="Times New Roman" w:cs="Times New Roman"/>
-          <w:b/>
-          <w:bCs/>
-        </w:rPr>
-        <w:t xml:space="preserve"> : w ϵ Σ*, n ≥ </w:t>
-      </w:r>
-      <w:proofErr w:type="gramStart"/>
-      <w:r>
-        <w:rPr>
-          <w:rFonts w:ascii="Times New Roman" w:hAnsi="Times New Roman" w:cs="Times New Roman"/>
-          <w:b/>
-          <w:bCs/>
-        </w:rPr>
-        <w:t>1 }</w:t>
-      </w:r>
-      <w:proofErr w:type="gramEnd"/>
-    </w:p>
-    <w:p>
-      <w:pPr>
-        <w:contextualSpacing/>
-        <w:rPr>
-          <w:rFonts w:ascii="Times New Roman" w:hAnsi="Times New Roman" w:cs="Times New Roman"/>
-        </w:rPr>
-      </w:pPr>
-    </w:p>
-    <w:p>
-      <w:pPr>
-        <w:contextualSpacing/>
-        <w:rPr>
-          <w:rFonts w:ascii="Times New Roman" w:hAnsi="Times New Roman" w:cs="Times New Roman"/>
-        </w:rPr>
-      </w:pPr>
-      <w:r>
-        <w:rPr>
-          <w:rFonts w:ascii="Times New Roman" w:hAnsi="Times New Roman" w:cs="Times New Roman"/>
-        </w:rPr>
-        <w:t xml:space="preserve">S -&gt; </w:t>
-      </w:r>
-      <w:proofErr w:type="spellStart"/>
-      <w:r>
-        <w:rPr>
-          <w:rFonts w:ascii="Times New Roman" w:hAnsi="Times New Roman" w:cs="Times New Roman"/>
-        </w:rPr>
-        <w:t>aTb</w:t>
-      </w:r>
-      <w:proofErr w:type="spellEnd"/>
-      <w:r>
-        <w:rPr>
-          <w:rFonts w:ascii="Times New Roman" w:hAnsi="Times New Roman" w:cs="Times New Roman"/>
-        </w:rPr>
-        <w:t xml:space="preserve"> | </w:t>
-      </w:r>
-      <w:proofErr w:type="spellStart"/>
-      <w:r>
-        <w:rPr>
-          <w:rFonts w:ascii="Times New Roman" w:hAnsi="Times New Roman" w:cs="Times New Roman"/>
-        </w:rPr>
-        <w:t>aSb</w:t>
-      </w:r>
-      <w:proofErr w:type="spellEnd"/>
-    </w:p>
-    <w:p>
-      <w:pPr>
-        <w:contextualSpacing/>
-        <w:rPr>
-          <w:rFonts w:ascii="Times New Roman" w:hAnsi="Times New Roman" w:cs="Times New Roman"/>
-        </w:rPr>
-      </w:pPr>
-      <w:r>
-        <w:rPr>
-          <w:rFonts w:ascii="Times New Roman" w:hAnsi="Times New Roman" w:cs="Times New Roman"/>
-        </w:rPr>
-        <w:t xml:space="preserve">T -&gt; </w:t>
+      <w:proofErr w:type="spellEnd"/>
+      <w:r>
+        <w:rPr>
+          <w:rFonts w:ascii="Times New Roman" w:hAnsi="Times New Roman" w:cs="Times New Roman"/>
+        </w:rPr>
+        <w:t xml:space="preserve"> -&gt; </w:t>
       </w:r>
       <w:proofErr w:type="spellStart"/>
       <w:r>
@@ -3357,14 +3413,6 @@
         <w:contextualSpacing/>
         <w:rPr>
           <w:rFonts w:ascii="Times New Roman" w:hAnsi="Times New Roman" w:cs="Times New Roman"/>
-        </w:rPr>
-      </w:pPr>
-    </w:p>
-    <w:p>
-      <w:pPr>
-        <w:contextualSpacing/>
-        <w:rPr>
-          <w:rFonts w:ascii="Times New Roman" w:hAnsi="Times New Roman" w:cs="Times New Roman"/>
           <w:b/>
           <w:bCs/>
           <w:sz w:val="32"/>
@@ -3381,7 +3429,6 @@
           <w:szCs w:val="32"/>
           <w:u w:val="single"/>
         </w:rPr>
-        <w:lastRenderedPageBreak/>
         <w:t>Section 5.2</w:t>
       </w:r>
     </w:p>
@@ -4170,29 +4217,29 @@
           <w:b/>
           <w:bCs/>
         </w:rPr>
+        <w:t>9) Construct an unambiguous grammar equivalent to the grammar is Exercise 8.</w:t>
+      </w:r>
+    </w:p>
+    <w:p>
+      <w:pPr>
+        <w:contextualSpacing/>
+        <w:rPr>
+          <w:rFonts w:ascii="Times New Roman" w:hAnsi="Times New Roman" w:cs="Times New Roman"/>
+        </w:rPr>
+      </w:pPr>
+    </w:p>
+    <w:p>
+      <w:pPr>
+        <w:contextualSpacing/>
+        <w:rPr>
+          <w:rFonts w:ascii="Times New Roman" w:hAnsi="Times New Roman" w:cs="Times New Roman"/>
+        </w:rPr>
+      </w:pPr>
+      <w:r>
+        <w:rPr>
+          <w:rFonts w:ascii="Times New Roman" w:hAnsi="Times New Roman" w:cs="Times New Roman"/>
+        </w:rPr>
         <w:lastRenderedPageBreak/>
-        <w:t>9) Construct an unambiguous grammar equivalent to the grammar is Exercise 8.</w:t>
-      </w:r>
-    </w:p>
-    <w:p>
-      <w:pPr>
-        <w:contextualSpacing/>
-        <w:rPr>
-          <w:rFonts w:ascii="Times New Roman" w:hAnsi="Times New Roman" w:cs="Times New Roman"/>
-        </w:rPr>
-      </w:pPr>
-    </w:p>
-    <w:p>
-      <w:pPr>
-        <w:contextualSpacing/>
-        <w:rPr>
-          <w:rFonts w:ascii="Times New Roman" w:hAnsi="Times New Roman" w:cs="Times New Roman"/>
-        </w:rPr>
-      </w:pPr>
-      <w:r>
-        <w:rPr>
-          <w:rFonts w:ascii="Times New Roman" w:hAnsi="Times New Roman" w:cs="Times New Roman"/>
-        </w:rPr>
         <w:t>S -&gt; AB</w:t>
       </w:r>
     </w:p>
@@ -4774,7 +4821,7 @@
         <w:rPr>
           <w:rFonts w:ascii="Times New Roman" w:hAnsi="Times New Roman" w:cs="Times New Roman"/>
         </w:rPr>
-        <w:t>7</w:t>
+        <w:t>8</w:t>
       </w:r>
       <w:r>
         <w:rPr>
@@ -4786,7 +4833,13 @@
         <w:rPr>
           <w:rFonts w:ascii="Times New Roman" w:hAnsi="Times New Roman" w:cs="Times New Roman"/>
         </w:rPr>
-        <w:t>, the length of the string</w:t>
+        <w:t xml:space="preserve"> + </w:t>
+      </w:r>
+      <w:r>
+        <w:rPr>
+          <w:rFonts w:ascii="Times New Roman" w:hAnsi="Times New Roman" w:cs="Times New Roman"/>
+        </w:rPr>
+        <w:t>1</w:t>
       </w:r>
       <w:r>
         <w:rPr>
@@ -4828,10 +4881,10 @@
           <w:szCs w:val="28"/>
         </w:rPr>
         <w:drawing>
-          <wp:inline distT="0" distB="0" distL="0" distR="0" wp14:anchorId="4E045DFC" wp14:editId="0FC632FD">
-            <wp:extent cx="3546673" cy="3467100"/>
-            <wp:effectExtent l="0" t="0" r="0" b="0"/>
-            <wp:docPr id="373739850" name="Picture 3"/>
+          <wp:inline distT="0" distB="0" distL="0" distR="0" wp14:anchorId="4CE3CB17" wp14:editId="479674E0">
+            <wp:extent cx="4373137" cy="3448050"/>
+            <wp:effectExtent l="0" t="0" r="8890" b="0"/>
+            <wp:docPr id="1862184578" name="Picture 3"/>
             <wp:cNvGraphicFramePr>
               <a:graphicFrameLocks xmlns:a="http://schemas.openxmlformats.org/drawingml/2006/main" noChangeAspect="1"/>
             </wp:cNvGraphicFramePr>
@@ -4860,7 +4913,7 @@
                   <pic:spPr bwMode="auto">
                     <a:xfrm>
                       <a:off x="0" y="0"/>
-                      <a:ext cx="3555189" cy="3475425"/>
+                      <a:ext cx="4378198" cy="3452040"/>
                     </a:xfrm>
                     <a:prstGeom prst="rect">
                       <a:avLst/>
@@ -4904,21 +4957,21 @@
           <w:sz w:val="28"/>
           <w:szCs w:val="28"/>
         </w:rPr>
+        <w:t>(Written work for problem 21)</w:t>
+      </w:r>
+    </w:p>
+    <w:p>
+      <w:pPr>
+        <w:contextualSpacing/>
+        <w:rPr>
+          <w:rFonts w:ascii="Times New Roman" w:hAnsi="Times New Roman" w:cs="Times New Roman"/>
+        </w:rPr>
+      </w:pPr>
+      <w:r>
+        <w:rPr>
+          <w:rFonts w:ascii="Times New Roman" w:hAnsi="Times New Roman" w:cs="Times New Roman"/>
+        </w:rPr>
         <w:lastRenderedPageBreak/>
-        <w:t>(Written work for problem 21)</w:t>
-      </w:r>
-    </w:p>
-    <w:p>
-      <w:pPr>
-        <w:contextualSpacing/>
-        <w:rPr>
-          <w:rFonts w:ascii="Times New Roman" w:hAnsi="Times New Roman" w:cs="Times New Roman"/>
-        </w:rPr>
-      </w:pPr>
-      <w:r>
-        <w:rPr>
-          <w:rFonts w:ascii="Times New Roman" w:hAnsi="Times New Roman" w:cs="Times New Roman"/>
-        </w:rPr>
         <w:t>Round 1:</w:t>
       </w:r>
     </w:p>
@@ -7712,151 +7765,151 @@
         <w:rPr>
           <w:rFonts w:ascii="Times New Roman" w:hAnsi="Times New Roman" w:cs="Times New Roman"/>
         </w:rPr>
+        <w:t xml:space="preserve">S =&gt; </w:t>
+      </w:r>
+      <w:proofErr w:type="spellStart"/>
+      <w:r>
+        <w:rPr>
+          <w:rFonts w:ascii="Times New Roman" w:hAnsi="Times New Roman" w:cs="Times New Roman"/>
+        </w:rPr>
+        <w:t>aAB</w:t>
+      </w:r>
+      <w:proofErr w:type="spellEnd"/>
+      <w:r>
+        <w:rPr>
+          <w:rFonts w:ascii="Times New Roman" w:hAnsi="Times New Roman" w:cs="Times New Roman"/>
+        </w:rPr>
+        <w:t xml:space="preserve"> =&gt; a(</w:t>
+      </w:r>
+      <w:proofErr w:type="spellStart"/>
+      <w:r>
+        <w:rPr>
+          <w:rFonts w:ascii="Times New Roman" w:hAnsi="Times New Roman" w:cs="Times New Roman"/>
+        </w:rPr>
+        <w:t>bBb</w:t>
+      </w:r>
+      <w:proofErr w:type="spellEnd"/>
+      <w:r>
+        <w:rPr>
+          <w:rFonts w:ascii="Times New Roman" w:hAnsi="Times New Roman" w:cs="Times New Roman"/>
+        </w:rPr>
+        <w:t>)B =&gt; ab(A)</w:t>
+      </w:r>
+      <w:proofErr w:type="spellStart"/>
+      <w:r>
+        <w:rPr>
+          <w:rFonts w:ascii="Times New Roman" w:hAnsi="Times New Roman" w:cs="Times New Roman"/>
+        </w:rPr>
+        <w:t>bB</w:t>
+      </w:r>
+      <w:proofErr w:type="spellEnd"/>
+      <w:r>
+        <w:rPr>
+          <w:rFonts w:ascii="Times New Roman" w:hAnsi="Times New Roman" w:cs="Times New Roman"/>
+        </w:rPr>
+        <w:t xml:space="preserve"> =&gt; ab(</w:t>
+      </w:r>
+      <w:proofErr w:type="spellStart"/>
+      <w:proofErr w:type="gramStart"/>
+      <w:r>
+        <w:rPr>
+          <w:rFonts w:ascii="Times New Roman" w:hAnsi="Times New Roman" w:cs="Times New Roman"/>
+        </w:rPr>
+        <w:t>bBb</w:t>
+      </w:r>
+      <w:proofErr w:type="spellEnd"/>
+      <w:proofErr w:type="gramEnd"/>
+      <w:r>
+        <w:rPr>
+          <w:rFonts w:ascii="Times New Roman" w:hAnsi="Times New Roman" w:cs="Times New Roman"/>
+        </w:rPr>
+        <w:t>)</w:t>
+      </w:r>
+      <w:proofErr w:type="spellStart"/>
+      <w:r>
+        <w:rPr>
+          <w:rFonts w:ascii="Times New Roman" w:hAnsi="Times New Roman" w:cs="Times New Roman"/>
+        </w:rPr>
+        <w:t>bB</w:t>
+      </w:r>
+      <w:proofErr w:type="spellEnd"/>
+      <w:r>
+        <w:rPr>
+          <w:rFonts w:ascii="Times New Roman" w:hAnsi="Times New Roman" w:cs="Times New Roman"/>
+        </w:rPr>
+        <w:t xml:space="preserve"> =&gt; abb(λ)</w:t>
+      </w:r>
+      <w:proofErr w:type="spellStart"/>
+      <w:r>
+        <w:rPr>
+          <w:rFonts w:ascii="Times New Roman" w:hAnsi="Times New Roman" w:cs="Times New Roman"/>
+        </w:rPr>
+        <w:t>bbB</w:t>
+      </w:r>
+      <w:proofErr w:type="spellEnd"/>
+      <w:r>
+        <w:rPr>
+          <w:rFonts w:ascii="Times New Roman" w:hAnsi="Times New Roman" w:cs="Times New Roman"/>
+        </w:rPr>
+        <w:t xml:space="preserve"> =&gt; </w:t>
+      </w:r>
+      <w:proofErr w:type="spellStart"/>
+      <w:r>
+        <w:rPr>
+          <w:rFonts w:ascii="Times New Roman" w:hAnsi="Times New Roman" w:cs="Times New Roman"/>
+        </w:rPr>
+        <w:t>abbbb</w:t>
+      </w:r>
+      <w:proofErr w:type="spellEnd"/>
+      <w:r>
+        <w:rPr>
+          <w:rFonts w:ascii="Times New Roman" w:hAnsi="Times New Roman" w:cs="Times New Roman"/>
+        </w:rPr>
+        <w:t xml:space="preserve">(A) =&gt; </w:t>
+      </w:r>
+      <w:proofErr w:type="spellStart"/>
+      <w:r>
+        <w:rPr>
+          <w:rFonts w:ascii="Times New Roman" w:hAnsi="Times New Roman" w:cs="Times New Roman"/>
+        </w:rPr>
+        <w:t>abbbb</w:t>
+      </w:r>
+      <w:proofErr w:type="spellEnd"/>
+      <w:r>
+        <w:rPr>
+          <w:rFonts w:ascii="Times New Roman" w:hAnsi="Times New Roman" w:cs="Times New Roman"/>
+        </w:rPr>
+        <w:t>(</w:t>
+      </w:r>
+      <w:proofErr w:type="spellStart"/>
+      <w:proofErr w:type="gramStart"/>
+      <w:r>
+        <w:rPr>
+          <w:rFonts w:ascii="Times New Roman" w:hAnsi="Times New Roman" w:cs="Times New Roman"/>
+        </w:rPr>
+        <w:t>bBb</w:t>
+      </w:r>
+      <w:proofErr w:type="spellEnd"/>
+      <w:proofErr w:type="gramEnd"/>
+      <w:r>
+        <w:rPr>
+          <w:rFonts w:ascii="Times New Roman" w:hAnsi="Times New Roman" w:cs="Times New Roman"/>
+        </w:rPr>
+        <w:t>)</w:t>
+      </w:r>
+    </w:p>
+    <w:p>
+      <w:pPr>
+        <w:contextualSpacing/>
+        <w:rPr>
+          <w:rFonts w:ascii="Times New Roman" w:hAnsi="Times New Roman" w:cs="Times New Roman"/>
+        </w:rPr>
+      </w:pPr>
+      <w:r>
+        <w:rPr>
+          <w:rFonts w:ascii="Times New Roman" w:hAnsi="Times New Roman" w:cs="Times New Roman"/>
+        </w:rPr>
         <w:lastRenderedPageBreak/>
-        <w:t xml:space="preserve">S =&gt; </w:t>
-      </w:r>
-      <w:proofErr w:type="spellStart"/>
-      <w:r>
-        <w:rPr>
-          <w:rFonts w:ascii="Times New Roman" w:hAnsi="Times New Roman" w:cs="Times New Roman"/>
-        </w:rPr>
-        <w:t>aAB</w:t>
-      </w:r>
-      <w:proofErr w:type="spellEnd"/>
-      <w:r>
-        <w:rPr>
-          <w:rFonts w:ascii="Times New Roman" w:hAnsi="Times New Roman" w:cs="Times New Roman"/>
-        </w:rPr>
-        <w:t xml:space="preserve"> =&gt; a(</w:t>
-      </w:r>
-      <w:proofErr w:type="spellStart"/>
-      <w:r>
-        <w:rPr>
-          <w:rFonts w:ascii="Times New Roman" w:hAnsi="Times New Roman" w:cs="Times New Roman"/>
-        </w:rPr>
-        <w:t>bBb</w:t>
-      </w:r>
-      <w:proofErr w:type="spellEnd"/>
-      <w:r>
-        <w:rPr>
-          <w:rFonts w:ascii="Times New Roman" w:hAnsi="Times New Roman" w:cs="Times New Roman"/>
-        </w:rPr>
-        <w:t>)B =&gt; ab(A)</w:t>
-      </w:r>
-      <w:proofErr w:type="spellStart"/>
-      <w:r>
-        <w:rPr>
-          <w:rFonts w:ascii="Times New Roman" w:hAnsi="Times New Roman" w:cs="Times New Roman"/>
-        </w:rPr>
-        <w:t>bB</w:t>
-      </w:r>
-      <w:proofErr w:type="spellEnd"/>
-      <w:r>
-        <w:rPr>
-          <w:rFonts w:ascii="Times New Roman" w:hAnsi="Times New Roman" w:cs="Times New Roman"/>
-        </w:rPr>
-        <w:t xml:space="preserve"> =&gt; ab(</w:t>
-      </w:r>
-      <w:proofErr w:type="spellStart"/>
-      <w:proofErr w:type="gramStart"/>
-      <w:r>
-        <w:rPr>
-          <w:rFonts w:ascii="Times New Roman" w:hAnsi="Times New Roman" w:cs="Times New Roman"/>
-        </w:rPr>
-        <w:t>bBb</w:t>
-      </w:r>
-      <w:proofErr w:type="spellEnd"/>
-      <w:proofErr w:type="gramEnd"/>
-      <w:r>
-        <w:rPr>
-          <w:rFonts w:ascii="Times New Roman" w:hAnsi="Times New Roman" w:cs="Times New Roman"/>
-        </w:rPr>
-        <w:t>)</w:t>
-      </w:r>
-      <w:proofErr w:type="spellStart"/>
-      <w:r>
-        <w:rPr>
-          <w:rFonts w:ascii="Times New Roman" w:hAnsi="Times New Roman" w:cs="Times New Roman"/>
-        </w:rPr>
-        <w:t>bB</w:t>
-      </w:r>
-      <w:proofErr w:type="spellEnd"/>
-      <w:r>
-        <w:rPr>
-          <w:rFonts w:ascii="Times New Roman" w:hAnsi="Times New Roman" w:cs="Times New Roman"/>
-        </w:rPr>
-        <w:t xml:space="preserve"> =&gt; abb(λ)</w:t>
-      </w:r>
-      <w:proofErr w:type="spellStart"/>
-      <w:r>
-        <w:rPr>
-          <w:rFonts w:ascii="Times New Roman" w:hAnsi="Times New Roman" w:cs="Times New Roman"/>
-        </w:rPr>
-        <w:t>bbB</w:t>
-      </w:r>
-      <w:proofErr w:type="spellEnd"/>
-      <w:r>
-        <w:rPr>
-          <w:rFonts w:ascii="Times New Roman" w:hAnsi="Times New Roman" w:cs="Times New Roman"/>
-        </w:rPr>
-        <w:t xml:space="preserve"> =&gt; </w:t>
-      </w:r>
-      <w:proofErr w:type="spellStart"/>
-      <w:r>
-        <w:rPr>
-          <w:rFonts w:ascii="Times New Roman" w:hAnsi="Times New Roman" w:cs="Times New Roman"/>
-        </w:rPr>
-        <w:t>abbbb</w:t>
-      </w:r>
-      <w:proofErr w:type="spellEnd"/>
-      <w:r>
-        <w:rPr>
-          <w:rFonts w:ascii="Times New Roman" w:hAnsi="Times New Roman" w:cs="Times New Roman"/>
-        </w:rPr>
-        <w:t xml:space="preserve">(A) =&gt; </w:t>
-      </w:r>
-      <w:proofErr w:type="spellStart"/>
-      <w:r>
-        <w:rPr>
-          <w:rFonts w:ascii="Times New Roman" w:hAnsi="Times New Roman" w:cs="Times New Roman"/>
-        </w:rPr>
-        <w:t>abbbb</w:t>
-      </w:r>
-      <w:proofErr w:type="spellEnd"/>
-      <w:r>
-        <w:rPr>
-          <w:rFonts w:ascii="Times New Roman" w:hAnsi="Times New Roman" w:cs="Times New Roman"/>
-        </w:rPr>
-        <w:t>(</w:t>
-      </w:r>
-      <w:proofErr w:type="spellStart"/>
-      <w:proofErr w:type="gramStart"/>
-      <w:r>
-        <w:rPr>
-          <w:rFonts w:ascii="Times New Roman" w:hAnsi="Times New Roman" w:cs="Times New Roman"/>
-        </w:rPr>
-        <w:t>bBb</w:t>
-      </w:r>
-      <w:proofErr w:type="spellEnd"/>
-      <w:proofErr w:type="gramEnd"/>
-      <w:r>
-        <w:rPr>
-          <w:rFonts w:ascii="Times New Roman" w:hAnsi="Times New Roman" w:cs="Times New Roman"/>
-        </w:rPr>
-        <w:t>)</w:t>
-      </w:r>
-    </w:p>
-    <w:p>
-      <w:pPr>
-        <w:contextualSpacing/>
-        <w:rPr>
-          <w:rFonts w:ascii="Times New Roman" w:hAnsi="Times New Roman" w:cs="Times New Roman"/>
-        </w:rPr>
-      </w:pPr>
-      <w:r>
-        <w:rPr>
-          <w:rFonts w:ascii="Times New Roman" w:hAnsi="Times New Roman" w:cs="Times New Roman"/>
-        </w:rPr>
         <w:t xml:space="preserve">S=&gt; </w:t>
       </w:r>
       <w:proofErr w:type="spellStart"/>
@@ -9519,7 +9572,6 @@
           <w:szCs w:val="32"/>
           <w:u w:val="single"/>
         </w:rPr>
-        <w:lastRenderedPageBreak/>
         <w:t>Section 6.1:</w:t>
       </w:r>
     </w:p>

</xml_diff>